<commit_message>
Rebuild interview appendix from the revised interview sources
Four of the interviews were revised after the first build. Every answer
now sits in the 191 to 270 word band, which is the twelve to nineteen
lines the paper calls for, with none falling short.

Co-Authored-By: Claude Fable 5 <noreply@anthropic.com>
Claude-Session: https://claude.ai/code/session_01Aebwgiv2BDsZYZ7oiMCAJ9
</commit_message>
<xml_diff>
--- a/seminar-interviews/ראיונות-עומק-ממוגרפיה.docx
+++ b/seminar-interviews/ראיונות-עומק-ממוגרפיה.docx
@@ -4963,7 +4963,7 @@
           <w:szCs w:val="24"/>
           <w:rtl/>
         </w:rPr>
-        <w:t xml:space="preserve">ת: טוב. אז ג'ולייט חורי, בת חמישים ושש, נולדתי בחיפה, בבית שהיה של סבתא שלי בוואדי ניסנאס, ומאז שהתחתנתי אני בעבאס. שלוש שנים בלבד לא גרתי כאן, כשלמדתי ספרות ערבית בירושלים, ואפילו אז הייתי חוזרת כל יום חמישי. בעלי ג'ורג' רואה חשבון, יש לו משרד קטן עם שתי עובדות, ובעונת הדוחות אני כמעט לא רואה אותו. שני בנים. סאמי בן עשרים ותשע, מהנדס, גר בברלין כבר ארבע שנים, מדבר איתי בווצאפ כל יום ראשון ואומר שהוא חוזר, ואני כבר הפסקתי לשאול מתי. נדים בן עשרים ושש, בתל אביב, עורך וידאו, מגיע כל שבועיים עם שקית כביסה. [מחייכת] יום רגיל אצלי מתחיל בחמש וארבעים. קפה עם ג'ורג' במרפסת, זה החלק היחיד ביום שהוא באמת שלי, ובשבע ורבע אני כאן. תשע עשרה שנה אני מזכירה ראשית בבית הספר הזה. כתוב מזכירה, אבל תשאלי את המנהל מי יודע איפה נמצא תיק של תלמיד משנת אלפיים ושמונה. שש מאות ארבעים תלמידים, שמונים ושלושה עובדים, ואמא שנכנסת לפה בוכה כי לא הבינה מכתב מהביטוח הלאומי. בארבע אני יוצאת, קונה משהו בדרך, ובשש וחצי אני אצל אמא שלי. היא בת שמונים ושלוש, גרה שני רחובות ממני, ומתעקשת שהיא לא צריכה אף אחד. בשישי אני עושה לה קפה ואנחנו יושבות ולא מדברות על שום דבר מיוחד. זה הכול, בעצם. זה נשמע קטן כשאומרים את זה ככה ברצף.</w:t>
+        <w:t xml:space="preserve">ת: טוב. אז ג'ולייט חורי, בת חמישים ושש, נולדתי בחיפה, בבית שהיה של סבתא שלי בוואדי ניסנאס, ומאז שהתחתנתי אני בעבאס. שלוש שנים בלבד לא גרתי כאן, כשלמדתי ספרות ערבית בירושלים, ואפילו אז הייתי חוזרת כל יום חמישי. בעלי ג'ורג' רואה חשבון, יש לו משרד קטן עם שתי עובדות, ובעונת הדוחות אני כמעט לא רואה אותו. שני בנים. סאמי בן עשרים ותשע, מהנדס, גר בברלין כבר ארבע שנים, מדבר איתי בווצאפ כל יום ראשון ואומר שהוא חוזר, ואני כבר הפסקתי לשאול מתי. נדים בן עשרים ושש, בתל אביב, עורך וידאו, מגיע כל שבועיים עם שקית כביסה. [מחייכת] יום רגיל אצלי מתחיל בחמש וארבעים. קפה עם ג'ורג' במרפסת, זה החלק היחיד ביום שהוא באמת שלי, ובשבע ורבע אני כאן. תשע עשרה שנה אני מזכירה ראשית בבית הספר הזה. כתוב מזכירה, אבל תשאלי את המנהל מי יודע איפה נמצא תיק של תלמיד משנת אלפיים ושמונה. שש מאות ארבעים תלמידים, שמונים ושלושה עובדים, ואמא שנכנסת לפה בוכה כי לא הבינה מכתב מהביטוח הלאומי. בארבע אני יוצאת, קונה משהו בדרך, ובשש וחצי אני אצל אמא שלי. היא בת שמונים ושלוש, גרה שני רחובות ממני, ומתעקשת שהיא לא צריכה אף אחד. בשישי אני עושה לה קפה ואנחנו יושבות ולא מדברות על שום דבר מיוחד. בערב אני קוראת. בעיקר בערבית, לפעמים בעברית, למדתי ספרות ערבית ולא ויתרתי על זה גם אם אני יושבת עשרים שנה מול טפסים. זה הכול, בעצם. זה נשמע קטן כשאומרים את זה ככה ברצף, אבל אני לא מרגישה שזה קטן.</w:t>
       </w:r>
     </w:p>
     <w:p>
@@ -5131,7 +5131,7 @@
           <w:szCs w:val="24"/>
           <w:rtl/>
         </w:rPr>
-        <w:t xml:space="preserve">ת: אני אספר לך על האחרונה, במרץ, כי היא הכי טרייה. אבל תדעי שהיא כבר לא בחיפה. המכון ברחוב הרצל נסגר לפני שנתיים והעבירו את כולנו לקריות. אז בשש וחצי בבוקר אני קמה, ואסור דאודורנט, זה הדבר הראשון שאת זוכרת, כי הם מסבירים שזה עושה נקודות בצילום. וזה נשמע פעוט, אבל אני יוצאת מהבית בשבע בבוקר לבית ספר בלי דאודורנט, ואני יושבת מול הורים כל היום. ג'ורג' הציע להסיע, אמרתי לו שאני נוסעת לבד, זה עשרים וחמש דקות. חנייה שם זה סיפור בפני עצמו, הסתובבתי שתים עשרה דקות. התור היה לשבע וחמישים, נכנסתי בשמונה ועשרים. חדר המתנה עם שבע נשים, כולן בחלוקים הוורודים האלה שנפתחים מקדימה, ואף אחת לא מסתכלת על אף אחת, כולן בטלפון. קוראים לך בשם פרטי, ג'ולייט, וזה תמיד עושה לי משהו, אני בת חמישים ושש והם קוראים לי כמו לילדה בגן. הטכנאית הייתה נחמדה, בחורה צעירה, הסבירה לי כל שלב. מורידה חלוק מצד אחד, מניחה את השד על הפלטה, מזיזה לך את הכתף, אומרת תישעני, תירגעי, אל תזוזי, ולוחצת. זה כואב. אני יודעת שכולם אומרים שזה לא כואב, אבל זה כואב בערך שבע שניות ואז נגמר. ארבעה צילומים, שניים לכל צד. כל הבדיקה אחת עשרה דקות, מדדתי, יש לי הרגל כזה. יצאתי, חזרתי לאוטו, קניתי קפה בדרך והייתי בבית הספר בתשע ועשרים, בדיוק בצלצול. ואז מחכים לתשובה. וזה החלק שאף אחד לא מספר עליו.</w:t>
+        <w:t xml:space="preserve">ת: אני אספר לך על האחרונה, במרץ, כי היא הכי טרייה. אבל תדעי שהיא כבר לא בחיפה. המכון ברחוב הרצל נסגר לפני שנתיים והעבירו את כולנו לקריות. אז בשש וחצי בבוקר אני קמה, ואסור דאודורנט, זה הדבר הראשון שאת זוכרת, כי הם מסבירים שזה עושה נקודות בצילום. וזה נשמע פעוט, אבל אני יוצאת מהבית בשבע בבוקר לבית ספר בלי דאודורנט, ואני יושבת מול הורים כל היום. ג'ורג' הציע להסיע, אמרתי לו שאני נוסעת לבד, זה עשרים וחמש דקות. חנייה שם זה סיפור בפני עצמו, הסתובבתי שתים עשרה דקות. התור היה לשבע וחמישים, נכנסתי בשמונה ועשרים. חדר המתנה עם שבע נשים, כולן בחלוקים הוורודים האלה שנפתחים מקדימה, ואף אחת לא מסתכלת על אף אחת, כולן בטלפון. קוראים לך בשם פרטי, ג'ולייט, וזה תמיד עושה לי משהו, אני בת חמישים ושש והם קוראים לי כמו לילדה בגן. הטכנאית הייתה נחמדה, בחורה צעירה, הסבירה לי כל שלב. מורידה חלוק מצד אחד, מניחה את השד על הפלטה, מזיזה לך את הכתף, אומרת תישעני, תירגעי, אל תזוזי, ולוחצת. זה כואב. אני יודעת שכולם אומרים שזה לא כואב, אבל זה כואב בערך שבע שניות ואז נגמר. ארבעה צילומים, שניים לכל צד. כל הבדיקה אחת עשרה דקות, מדדתי, יש לי הרגל כזה. בסוף היא אמרה לי תתלבשי, התשובה תגיע לרופאה שלך. שאלתי מתי, והיא אמרה תלוי בעומס. תלוי בעומס. יצאתי, חזרתי לאוטו, ישבתי שם דקה עם הידיים על ההגה בלי לעשות כלום, אני לא יודעת למה, ואז קניתי קפה בדרך והייתי בבית הספר בתשע ועשרים, בדיוק בצלצול. בהפסקה הראשונה כבר טיפלתי בילד שנפל במגרש. ואז מחכים לתשובה. וזה החלק שאף אחד לא מספר עליו.</w:t>
       </w:r>
     </w:p>
     <w:p>
@@ -5215,7 +5215,7 @@
           <w:szCs w:val="24"/>
           <w:rtl/>
         </w:rPr>
-        <w:t xml:space="preserve">ת: אני רוצה לעצור על המילה הזאת, צניעות. אני לא אוהבת אותה בהקשר הזה, וזה לא בגלל שאני נגד צניעות. גדלתי בבית נוצרי מסורתי, אמא שלי לא הייתה יוצאת מהבית בלי גרביונים, ולמדתי אצל נזירות עד כיתה ח'. אבל אף אחד אצלנו בבית לא קישר בין הגוף שלי לבין רופא. הגוף שלי בחדר צילום הוא לא הגוף שלי בכנסייה. אלה שני דברים אחרים לגמרי, ולא הייתי צריכה שמישהו יסביר לי את זה, זה היה מובן מאליו. שלוש דקות אני עומדת חצי לבושה מול בחורה בת שלושים שראתה היום עוד ארבע עשרה נשים. היא לא רואה אותי. היא רואה רקמה. אני אגיד לך מה כן מפריע לי, ואולי זה לא מה שאת מחפשת. מפריע לי שאת שואלת אותי את השאלה הזאת. לא אותך אישית, את עושה את העבודה שלך, אבל תשימי לב מה יש בתוכה. כשאישה יהודייה לא הולכת לממוגרפיה אומרים שהיא עסוקה או שהיא מפחדת מהתוצאה. כשאישה ערבייה לא הולכת אומרים מיד שהיא מתביישת. וזה מסביר הכול וזה גם לא מסביר כלום, כי אחר כך כבר אף אחד לא בודק אם המכון נסגר לה בעיר ואם המכתב הגיע בעברית. [שותקת] אני יודעת שיש נשים שבשבילן זה כן קשה. יש. יש לי בנות דודות שאצלן זה לא יעלה על הדעת. אבל לא כל הימנעות היא בושה, ולפעמים בושה זו המילה שנוח לתת לאישה במקום לתת לה תור.</w:t>
+        <w:t xml:space="preserve">ת: אני רוצה לעצור על המילה הזאת, צניעות. אני לא אוהבת אותה בהקשר הזה, וזה לא בגלל שאני נגד צניעות. גדלתי בבית נוצרי מסורתי, אמא שלי לא הייתה יוצאת מהבית בלי גרביונים, ולמדתי אצל נזירות עד כיתה ח'. אבל אף אחד אצלנו בבית לא קישר בין הגוף שלי לבין רופא. הגוף שלי בחדר צילום הוא לא הגוף שלי בכנסייה. אלה שני דברים אחרים לגמרי, ולא הייתי צריכה שמישהו יסביר לי את זה, זה היה מובן מאליו. שלוש דקות אני עומדת חצי לבושה מול בחורה בת שלושים שראתה היום עוד ארבע עשרה נשים. היא לא רואה אותי. היא רואה רקמה. אני אגיד לך מה כן מפריע לי, ואולי זה לא מה שאת מחפשת. מפריע לי שאת שואלת אותי את השאלה הזאת. לא אותך אישית, את עושה את העבודה שלך, אבל תשימי לב מה יש בתוכה. כשאישה יהודייה לא הולכת לממוגרפיה אומרים שהיא עסוקה או שהיא מפחדת מהתוצאה. כשאישה ערבייה לא הולכת אומרים מיד שהיא מתביישת. וזה מסביר הכול וזה גם לא מסביר כלום, כי אחר כך כבר אף אחד לא בודק אם המכון נסגר לה בעיר ואם המכתב הגיע בעברית. [שותקת] אני יודעת שיש נשים שבשבילן זה כן קשה. יש. יש לי בנות דודות בכפר יאסיף שאצלן זה לא יעלה על הדעת, נביהה, בת שישים ושתיים, לא תיכנס לחדר כזה, ואני לא יושבת פה ומתיימרת להסביר אותה. אני גם לא בטוחה שהיא הייתה קוראת לזה בושה. אולי היא הייתה קוראת לזה שזה לא מקובל, וזה בכלל לא אותו דבר, כי בושה זה משהו שיש לך בפנים ולא מקובל זה משהו שאחרים עושים לך. אבל לא כל הימנעות היא בושה, ולפעמים בושה זו המילה שנוח לתת לאישה במקום לתת לה תור.</w:t>
       </w:r>
     </w:p>
     <w:p>
@@ -5299,7 +5299,7 @@
           <w:szCs w:val="24"/>
           <w:rtl/>
         </w:rPr>
-        <w:t xml:space="preserve">ת: תלוי אצל מי. אצלי בבית, ביני לבין ג'ורג', פתוח לגמרי. בחדר מורים, פתוח. אנחנו מדברות על זה בהפסקה כמו שמדברות על ילדים ועל תלושי שכר. אבל אצל אמא שלי ובדור שלה זה אחרת. יש לנו דודה, אחות של אבא שלי, שחלתה כשהייתי בת עשרים ושתיים, ואף אחד לא אמר לי את המילה. אמרו לי היא חולה. אמרו אלמרד, המחלה. ואם כבר אומרים סרטאן, מוסיפים מיד אחריו אללה יבעד אלשר, שאלוהים ירחיק את הרע, כאילו המילה עצמה מזמינה משהו לבית. גם היום כשאני אומרת את המילה הזאת ליד אמא שלי היא עושה ככה עם היד. [מדגימה] ואז יש את הצד השני של העניין, שגם הוא לא נעים. כשסמר חלתה, תוך שבוע כל בית הספר ידע. אני לא סיפרתי, היא סיפרה לשתי מורות, וזהו. ותוך שבועיים באו אליי הורים לשאול מה שלומה. הורים, לא מורים. אז מצד אחד אנחנו הכי פתוחים בעולם, ומצד שני אין אצלנו דבר כזה מידע פרטי. וזה משפיע. אני בטוחה שיש נשים שלא הולכות לבדיקה לא כי הן מפחדות מהמחלה, אלא כי הן מפחדות שהמזכירה במרפאה היא בת דודה של השכנה. אצלי בעיר זה פחות, חיפה גדולה, אף אחד לא מכיר אף אחד. בכפר יאסיף, אצל בנות הדודות שלי, כל אחד יודע מי נכנס לאיזה חדר ומתי יצא. זו לא בהכרח רכילות רעה. זה פשוט שאין לך איפה להיות לבד.</w:t>
+        <w:t xml:space="preserve">ת: תלוי אצל מי. אצלי בבית, ביני לבין ג'ורג', פתוח לגמרי. בחדר מורים, פתוח. אנחנו מדברות על זה בהפסקה כמו שמדברות על ילדים ועל תלושי שכר. אבל אצל אמא שלי ובדור שלה זה אחרת. יש לנו דודה, אחות של אבא שלי, שחלתה כשהייתי בת עשרים ושתיים, ואף אחד לא אמר לי את המילה. אמרו לי היא חולה. אמרו אלמרד, המחלה. ואם כבר אומרים סרטאן, מוסיפים מיד אחריו אללה יבעד אלשר, שאלוהים ירחיק את הרע, כאילו המילה עצמה מזמינה משהו לבית. גם היום כשאני אומרת את המילה הזאת ליד אמא שלי היא עושה ככה עם היד. [מדגימה] ואז יש את הצד השני של העניין, שגם הוא לא נעים. כשסמר חלתה, תוך שבוע כל בית הספר ידע. אני לא סיפרתי, היא סיפרה לשתי מורות, וזהו. ותוך שבועיים באו אליי הורים לשאול מה שלומה. הורים, לא מורים. אז מצד אחד אנחנו הכי פתוחים בעולם, ומצד שני אין אצלנו דבר כזה מידע פרטי. וזה משפיע. אני בטוחה שיש נשים שלא הולכות לבדיקה לא כי הן מפחדות מהמחלה, אלא כי הן מפחדות שהמזכירה במרפאה היא בת דודה של השכנה. אצלי בעיר זה פחות, חיפה גדולה, אף אחד לא מכיר אף אחד. בכפר יאסיף, אצל בנות הדודות שלי, כל אחד יודע מי נכנס לאיזה חדר ומתי יצא. זו לא בהכרח רכילות רעה. אצלם זה גם דאגה, מביאים אוכל, באים לבקר, לא עוזבים אותך לבד. זה פשוט שאין לך איפה להיות לבד גם כשאת רוצה.</w:t>
       </w:r>
     </w:p>
     <w:p>
@@ -5425,7 +5425,7 @@
           <w:szCs w:val="24"/>
           <w:rtl/>
         </w:rPr>
-        <w:t xml:space="preserve">ת: עכשיו הגענו לחלק שלי. [מיישרת את הגב] תשמעי, אני עובדת בתוך בירוקרטיה תשע עשרה שנה, אני יודעת מה זו מערכת ואני יודעת שאי אפשר הכול. אבל יש דברים שהם פשוט חוסר מחשבה. אחת. המכון ברחוב הרצל נסגר לפני שנתיים. לא הודיעו לי, גיליתי כשהתקשרתי לקבוע. אמרו לי גברת, זה עבר לקריות. אני גרה בעבאס. זה בערך שלושים וחמישה קילומטר הלוך ושוב, עשרים וחמש דקות באוטו בלי פקק, ובאוטובוס זה שני קווים ושעה לכל כיוון. לי יש רכב ורישיון ובעל שמציע להסיע. לאישה בת שישים וחמש בלי רכב זה סוף הסיפור, היא לא הולכת. שתיים. התורים. בפעם האחרונה קבעתי בנובמבר וקיבלתי מרץ. ארבעה חודשים לבדיקת סקר. שלוש, וזה הדבר שאני הכי כועסת עליו. לפני ארבע שנים קיבלתי הודעה בטלפון ביום חמישי בשעה שש וארבעים בערב. אני זוכרת את השעה כי עמדתי בסופר. כתוב, ואני מצטטת לך כמעט מילה במילה, נדרשת השלמת בדיקה, נא ליצור קשר עם המכון. זהו. בלי מספר טלפון בהודעה. התקשרתי למוקד, סגור. חמישי בערב, שישי, שבת. עד יום ראשון בשמונה בבוקר חייתי עם ההודעה הזאת בכיס. שני לילות. ג'ורג' ישן ואני בסלון עם הטלפון ביד. וביום ראשון הפקידה אמרה לי בטון הכי רגיל בעולם, גברת חורי, זה שגרתי, בואי לאולטרסאונד. שגרתי. בשבילה שגרתי. וארבע, הטכנאית בקריות בפעם שלפני האחרונה דיברה בטלפון תוך כדי הבדיקה. עם אמא שלה, על אינסטלטור. מזיזה לי את הכתף ביד אחת ואומרת לטלפון תגידי לו שיבוא ביום שני. לא אמרתי כלום. וזה מה שמפריע לי היום, שלא אמרתי כלום.</w:t>
+        <w:t xml:space="preserve">ת: עכשיו הגענו לחלק שלי. [מיישרת את הגב] תשמעי, אני עובדת בתוך בירוקרטיה תשע עשרה שנה, אני יודעת מה זו מערכת ואני יודעת שאי אפשר הכול. אבל יש דברים שהם פשוט חוסר מחשבה. אחת. המכון ברחוב הרצל נסגר לפני שנתיים. לא הודיעו לי, גיליתי כשהתקשרתי לקבוע. אמרו לי גברת, זה עבר לקריות. אני גרה בעבאס. עשרים וחמש דקות באוטו בלי פקק, ובאוטובוס זה שני קווים ושעה לכל כיוון. לי יש רכב ורישיון ובעל שמציע להסיע. לאישה בת שישים וחמש בלי רכב זה סוף הסיפור, היא לא הולכת. שתיים. התורים. בפעם האחרונה קבעתי בנובמבר וקיבלתי מרץ. ארבעה חודשים לבדיקת סקר. שלוש, וזה הדבר שאני הכי כועסת עליו. לפני ארבע שנים קיבלתי הודעה בטלפון ביום חמישי בשש וארבעים בערב. אני זוכרת את השעה כי עמדתי בסופר. כתוב, ואני מצטטת כמעט מילה במילה, נדרשת השלמת בדיקה, נא ליצור קשר עם המכון. זהו. בלי מספר טלפון בהודעה. התקשרתי למוקד, סגור. חמישי בערב, שישי, שבת. עד יום ראשון בשמונה בבוקר חייתי עם ההודעה הזאת בכיס. שני לילות. ג'ורג' ישן ואני בסלון עם הטלפון ביד. וביום ראשון הפקידה אמרה לי בטון הכי רגיל, גברת חורי, זה שגרתי, בואי לאולטרסאונד. שגרתי. בשבילה שגרתי. וארבע, הטכנאית בקריות בפעם שלפני האחרונה דיברה בטלפון תוך כדי הבדיקה. עם אמא שלה, על אינסטלטור. מזיזה לי את הכתף ביד אחת ואומרת לטלפון תגידי לו שיבוא ביום שני. לא אמרתי כלום. וזה מה שמפריע לי היום, שלא אמרתי כלום. וחמש, השפה, ואת זה אני רואה מהצד השני של השולחן. פה, בחדר הזה, יושבות אצלי אמהות עם מכתבים בעברית ומבקשות שאקרא להן. אז אני יודעת בדיוק כמה מכתבים לא נקראים.</w:t>
       </w:r>
     </w:p>
     <w:p>
@@ -5509,7 +5509,7 @@
           <w:szCs w:val="24"/>
           <w:rtl/>
         </w:rPr>
-        <w:t xml:space="preserve">ת: סמר. היא מורה לאנגלית אצלנו, ישבנו יחד בחדר מורים עשר שנים לפני שזה קרה. לפני ארבע שנים, היא הייתה אז בת חמישים ושתיים, הלכה לממוגרפיה שגרתית, כמו שהולכים, בלי שום דבר מיוחד. בלי גוש, בלי כאב, בלי כלום. היא סיפרה לי אחר כך שהיא כמעט לא הלכה כי היה לה מבחן להכין. ומצאו משהו קטן, היא אמרה לי שהרדיולוג אמר שזה בגודל של גרגר אורז, ושהיא בעצמה לא הצליחה לראות את זה על המסך גם כשהראו לה עם האצבע. עשו לה ניתוח קטן, לא הורידו את השד, אחר כך הקרנות, חמישה שבועות כל יום, והיא המשיכה ללמד באמצע כל זה. היום היא בריאה. באה לבית ספר, צועקת על תלמידים, הכול בסדר. ומה זה שינה אצלי. תראי, בהתנהגות זה לא שינה כלום, כי אני כבר הלכתי שבע שנים לפני שזה קרה לה. אבל בראש שלי משהו התהפך. עד סמר חשבתי, בלי לנסח את זה לעצמי, שממוגרפיה זה כמו בדיקת דם, שהולכים בשביל לקבל אישור שהכול בסדר. הולכת, יוצא תקין, ממשיכים הלאה. אחרי סמר הבנתי שזה בכלל לא זה. הבדיקה לא באה להרגיע אותי. היא באה למצוא. והיא מחפשת דבר שאני בעצמי לא יכולה לגלות בשום צורה, כי אין מה להרגיש ואין מה לראות. זה נשמע כמו הבדל קטן במילים. אצלי זה היה הבדל אחר לגמרי. פתאום הבנתי למה זה חייב להיות לפי לוח שנה ולא לפי תחושה.</w:t>
+        <w:t xml:space="preserve">ת: סמר. היא מורה לאנגלית אצלנו, ישבנו יחד בחדר מורים עשר שנים לפני שזה קרה. לפני ארבע שנים, היא הייתה אז בת חמישים ושתיים, הלכה לממוגרפיה שגרתית, כמו שהולכים, בלי שום דבר מיוחד. בלי גוש, בלי כאב, בלי כלום. היא סיפרה לי אחר כך שהיא כמעט לא הלכה כי היה לה מבחן להכין. ומצאו משהו קטן, היא אמרה לי שהרדיולוג אמר שזה בגודל של גרגר אורז, ושהיא בעצמה לא הצליחה לראות את זה על המסך גם כשהראו לה עם האצבע. עשו לה ניתוח קטן, לא הורידו את השד, אחר כך הקרנות, חמישה שבועות כל יום, והיא המשיכה ללמד באמצע כל זה. היום היא בריאה. באה לבית ספר, צועקת על תלמידים, הכול בסדר. ומה זה שינה אצלי. תראי, בהתנהגות זה לא שינה כלום, כי אני כבר הלכתי שבע שנים לפני שזה קרה לה. אבל בראש שלי משהו התהפך. עד סמר חשבתי, בלי לנסח את זה לעצמי, שממוגרפיה זה כמו בדיקת דם, שהולכים בשביל לקבל אישור שהכול בסדר. הולכת, יוצא תקין, ממשיכים הלאה. אחרי סמר הבנתי שזה בכלל לא זה. הבדיקה לא באה להרגיע אותי. היא באה למצוא. והיא מחפשת דבר שאני בעצמי לא יכולה לגלות בשום צורה, כי אין מה להרגיש ואין מה לראות. זה נשמע כמו הבדל קטן במילים. אצלי זה היה הבדל אחר לגמרי. פתאום הבנתי למה זה חייב להיות לפי לוח שנה ולא לפי תחושה. וגם למדתי משהו על עצמי שלא אהבתי. בשבועיים הראשונים לא ידעתי איך להתנהג לידה. הבאתי אוכל, שאלתי מה שלומך, ובעצם רציתי שהיא תגיד לי שהכול בסדר כדי שאני אוכל להירגע. היא הרגיעה אותי. היא, החולה, הרגיעה אותי. עד היום אני חושבת על זה.</w:t>
       </w:r>
     </w:p>
     <w:p>
@@ -5593,7 +5593,7 @@
           <w:szCs w:val="24"/>
           <w:rtl/>
         </w:rPr>
-        <w:t xml:space="preserve">ת: לאישה בגילי שמתלבטת, אני חושבת שקודם כל הייתי שואלת אותה במה בדיוק היא מתלבטת, כי לכל אחת יש משהו אחר וזה לא אותו דבר בכלל. אם היא מפחדת מהתוצאה, הייתי מספרת לה על סמר, ובעיקר על החלק שסמר עצמה לא ראתה את זה על המסך. אם היא אומרת שאין לה זמן, הייתי אומרת לה שזה אחת עשרה דקות ושכל השאר זה החנייה, ושאם היא רוצה אני אקבע לה, כי אני טובה בזה. ואם היא לא רוצה ללכת לבד, שתגיד לי מתי ואני אבוא איתה. זה הכי פשוט וזה מה שאף אחד לא מציע. ומה שאני רוצה שיישאר, אני אגיד לך, וזה חשוב לי. אני אישה אחת מעבאס. אני עובדת, יש לי תואר, אני קוראת עברית ואנגלית, יש לי אוטו ובעל שמסיע ואמא שגרה שני רחובות ממני. הניסיון שלי לא מייצג כלום. הוא לא מייצג את בנות הדודות שלי בכפר יאסיף, שאצלן זה נראה אחרת לגמרי, ובכנות, אני לא באמת יודעת איך זה נראה אצלן, כי לא שאלתי אותן מעולם. ואני לא לגמרי בנוח עם זה שאני מדברת עליהן עכשיו ולא איתן. אנחנו נפגשות בחגים ומדברות על ילדים. אז אל תיקחי אותי ותכתבי שהנשים הערביות אומרות כך וכך. תכתבי שג'ולייט חורי אמרה. ואם יש דבר אחד שאני רוצה שיישאר, זה שלא כל מה שנראה כמו הימנעות הוא פחד. לפעמים זה פשוט שהמכון עבר לקריות.</w:t>
+        <w:t xml:space="preserve">ת: לאישה בגילי שמתלבטת, אני חושבת שקודם כל הייתי שואלת אותה במה בדיוק היא מתלבטת, כי לכל אחת יש משהו אחר וזה לא אותו דבר בכלל. אם היא מפחדת מהתוצאה, הייתי מספרת לה על סמר, ובעיקר על החלק שסמר עצמה לא ראתה את זה על המסך. אם היא אומרת שאין לה זמן, הייתי אומרת לה שזה אחת עשרה דקות ושכל השאר זה החנייה, ושאם היא רוצה אני אקבע לה, כי אני טובה בזה. ואם היא לא רוצה ללכת לבד, שתגיד לי מתי ואני אבוא איתה. זה הכי פשוט וזה מה שאף אחד לא מציע. ומה שאני רוצה שיישאר, אני אגיד לך, וזה חשוב לי. אני אישה אחת מעבאס. אני עובדת, יש לי תואר, אני קוראת עברית ואנגלית, יש לי אוטו ובעל שמסיע ואמא שגרה שני רחובות ממני. הניסיון שלי לא מייצג כלום. הוא לא מייצג את בנות הדודות שלי בכפר יאסיף, שאצלן זה נראה אחרת לגמרי, ובכנות, אני לא באמת יודעת איך זה נראה אצלן, כי לא שאלתי אותן מעולם. ואני לא לגמרי בנוח עם זה שאני מדברת עליהן עכשיו ולא איתן. אנחנו נפגשות בחגים ומדברות על ילדים. אז אל תיקחי אותי ותכתבי שהנשים הערביות אומרות כך וכך. תכתבי שג'ולייט חורי אמרה. ואם יש דבר אחד שאני רוצה שיישאר מכל השעה וחצי הזאת, זה שלא כל מה שנראה כמו הימנעות הוא פחד. לפעמים זה פשוט שהמכון עבר לקריות.</w:t>
       </w:r>
     </w:p>
     <w:p>
@@ -6645,7 +6645,7 @@
           <w:szCs w:val="24"/>
           <w:rtl/>
         </w:rPr>
-        <w:t xml:space="preserve">ת: לא עברתי. אף פעם. וגם לא כמעט. אני לא יכולה להגיד לך שכמעט הלכתי, כי לא ידעתי שיש לאן ללכת. את מבינה? זה לא שאמרתי לא. אף אחד לא אמר לי כן. אבל אני אגיד לך מה זה אצלנו לצאת מהבית ליום שלם, כי זה קשור לזה. כשראניה שברה את היד נסענו לסורוקה. סלמאן לקח יום מהעבודה, ויום כזה זה יום בלי כסף. יצאנו בשמונה בבוקר וחזרנו בשש בערב. לפני שיצאנו הכנתי אוכל לכולם, בישלתי בלילה, ודיברתי עם עאיישה שתבוא לשבת עם הקטנים אחרי הצהריים. מוחמד היה אז בן שנתיים והוא בא איתי, כי הוא לא נשאר עם אף אחד. בסורוקה חיכינו ארבע שעות. ארבע שעות עם ילד בן שנתיים ועם ילדה עם יד שבורה. אני לא נוסעת לבאר שבע לבד. אף פעם. תמיד עם סלמאן או עם סלים, לסלים יש אוטו. יש אוטובוס מהשוק, אני יודעת שיש, אבל אני לא יודעת איזה מספר ואיפה יורדים ואיך חוזרים, ואישה לבד שם, אני לא רגילה לזה. אז כל נסיעה כזאת צריך לארגן שבוע קודם. מי לוקח, מתי הוא פנוי, מי יהיה עם מוחמד, מה אוכלים בצהריים. בשביל יד שבורה עושים את זה. בשביל צילום שאני לא יודעת מה הוא, אף אחד לא יעשה את זה, וגם אני לא.</w:t>
+        <w:t xml:space="preserve">ת: לא עברתי. אף פעם. וגם לא כמעט. אני לא יכולה להגיד לך שכמעט הלכתי, כי לא ידעתי שיש לאן ללכת. את מבינה? זה לא שאמרתי לא. אף אחד לא אמר לי כן. אבל אני אגיד לך מה זה אצלנו לצאת מהבית ליום שלם, כי זה קשור לזה. כשראניה שברה את היד נסענו לסורוקה. סלמאן לקח יום מהעבודה, ויום כזה זה יום בלי כסף. יצאנו בשמונה בבוקר וחזרנו בשש בערב. לפני שיצאנו הכנתי אוכל לכולם, בישלתי בלילה, ודיברתי עם עאיישה שתבוא לשבת עם הקטנים אחרי הצהריים. מוחמד היה אז בן שנתיים והוא בא איתי, כי הוא לא נשאר עם אף אחד. בסורוקה חיכינו ארבע שעות. ארבע שעות עם ילד בן שנתיים ועם ילדה עם יד שבורה. אני לא נוסעת לבאר שבע לבד. אף פעם. תמיד עם סלמאן או עם סלים, לסלים יש אוטו. יש אוטובוס מהשוק, אני יודעת שיש, אבל אני לא יודעת איזה מספר ואיפה יורדים ואיך חוזרים, ואישה לבד שם, אני לא רגילה לזה. פעם אחת נסעתי לעיר בלי סלמאן, לפני שנים, לביטוח לאומי בגלל נייר שביקשו, והוא חיכה לי בחוץ ליד האוטו כל הזמן. אז גם אז לא הייתי לבד באמת. אז כל נסיעה כזאת צריך לארגן שבוע קודם. מי לוקח, מתי הוא פנוי, מי יהיה עם מוחמד, מה אוכלים בצהריים. וצריך לשאול את סלים מתי הוא חופשי, כי הוא עובד בחנות של החתן שלי ולא תמיד נותנים לו לצאת באמצע היום. בשביל יד שבורה עושים את זה. בשביל צילום שאני לא יודעת מה הוא, אף אחד לא יעשה את זה, וגם אני לא.</w:t>
       </w:r>
     </w:p>
     <w:p>
@@ -6729,7 +6729,7 @@
           <w:szCs w:val="24"/>
           <w:rtl/>
         </w:rPr>
-        <w:t xml:space="preserve">ת: מה זה אומר עליי... ילדתי תשעה ילדים. תשעה. בבית חולים, לא בבית, אמא שלי ילדה בבית אבל אני לא. אז ראו אותי, אני לא אשקר לך. בלידה את לא חושבת על זה בכלל, את חושבת שייצא הילד ושיהיה בסדר ושתגמר. אבל זה אחרת. בלידה יש סיבה, הילד יוצא, מה תעשי. אבל ללכת בעצמך, ברגליים שלך, ולהוריד בגדים בשביל מכונה, כשלא כואב לך שום דבר, בשביל מה? אמא שלי לימדה אותי שהגוף של אישה זה לבעל שלה ולרופא אם יש צורך. אם יש צורך, מותר. גם הדת אומרת ככה, שאם יש צורך מותר. אבל מי קובע שיש צורך? זאת השאלה שלי. אם רופא יגיד לי פאטמה, יש צורך, אני אלך ואוריד ולא אשאל אותו שאלות. בלי שאף אחד אמר, לא. ויש עוד דבר. אצלנו כולם מכירים את כולם. אם אני נכנסת לחדר ומורידה חולצה, ואחר כך אני יוצאת ובחוץ יושבת בת דודה שלי או שכנה, היא לא תשאל אותי כלום, אבל היא תדע. ואחר כך היא תגיד למישהי. סנא שלי בת תשע עשרה, זה גיל של דיבורים. אני חושבת על זה. [מתקנת את עצמה] לא שאני מתביישת בגוף שלי, אני לא ילדה, אני בת ארבעים וארבע. אני מתביישת מהעיניים של אנשים. זה שני דברים שונים לגמרי.</w:t>
+        <w:t xml:space="preserve">ת: מה זה אומר עליי... ילדתי תשעה ילדים. תשעה. בבית חולים, לא בבית, אמא שלי ילדה בבית אבל אני לא. אז ראו אותי, אני לא אשקר לך. בלידה את לא חושבת על זה בכלל, את חושבת שייצא הילד ושיהיה בסדר ושתגמר. אבל זה אחרת. בלידה יש סיבה, הילד יוצא, מה תעשי. אבל ללכת בעצמך, ברגליים שלך, ולהוריד בגדים בשביל מכונה, כשלא כואב לך שום דבר, בשביל מה? אמא שלי לימדה אותי שהגוף של אישה זה לבעל שלה ולרופא אם יש צורך. אם יש צורך, מותר. גם הדת אומרת ככה, שאם יש צורך מותר. אבל מי קובע שיש צורך? זאת השאלה שלי. אם רופא יגיד לי פאטמה, יש צורך, אני אלך ואוריד ולא אשאל אותו שאלות. בלי שאף אחד אמר, לא. ויש עוד דבר. אצלנו כולם מכירים את כולם. אם אני נכנסת לחדר ומורידה חולצה, ואחר כך אני יוצאת ובחוץ יושבת בת דודה שלי או שכנה, היא לא תשאל אותי כלום, אבל היא תדע. ואחר כך היא תגיד למישהי. סנא שלי בת תשע עשרה, זה גיל של דיבורים. אני חושבת על זה. אמא שלי הייתה אומרת שהמטפחת של אישה שווה יותר מהזהב שלה. אני לא בטוחה שזה נכון בדיוק ככה, ואני לא אומרת את זה לבנות שלי במילים האלה, אבל גדלתי על זה, ובגיל ארבעים וארבע את לא מוציאה דבר כזה מהראש. [מתקנת את עצמה] לא שאני מתביישת בגוף שלי, אני לא ילדה, אני בת ארבעים וארבע. אני מתביישת מהעיניים של אנשים. זה שני דברים שונים לגמרי.</w:t>
       </w:r>
     </w:p>
     <w:p>
@@ -6813,7 +6813,7 @@
           <w:szCs w:val="24"/>
           <w:rtl/>
         </w:rPr>
-        <w:t xml:space="preserve">ת: בשקט. לא מדברים. אומרים המחלה. אלמרד. לא אומרים את השם. אם מישהו חולה אומרים אללה ישפיהו, שאללה ירפא אותו, וממשיכים לדבר על משהו אחר. על אום זיאד לא ידעתי כלום עד שהיא מתה. ידענו שהיא נוסעת לבאר שבע הרבה, ראינו את האוטו של הבן שלה יוצא בבוקר. שאלו אותה והיא אמרה בדיקות, סתם בדיקות. אחרי שנה השיער שלה נפל, אז כבר כולם הבינו, אבל אף אחד לא אמר את המילה בקול. גם הבנות שלה לא. ואחרי שהיא מתה, אז דיברו. אז פתאום כולם ידעו הכול. למה לא מדברים? כי מפחדים. ואולי בגלל הבנות, זאת האמת. תראי, אם אומרים על משפחה שיש בה את המחלה, אז כשבאים לשאול על בת, אנשים חושבים פעמיים. אומרים המשפחה הזאת חולה. זה לא הוגן, אני יודעת שזה לא הוגן, אבל ככה זה אצלנו ואני לא אשנה את זה. יש לי שתי בנות לא נשואות בבית. אז אישה חושבת על זה לפני שהיא פותחת את הפה. ויש עוד סיבה, אולי הכי חזקה. אצלנו כשאומרים את המילה הזאת זה כמו להגיד שהיא נגמרה. אנשים שומעים סרטן וישר חושבים כמה זמן נשאר לה, מי ייקח את הילדים. לא חושבים שיש טיפול. אני לא יודעת אם יש טיפול, בכנות. אני מכירה אחת שמתה. אני לא מכירה אף אחת שהחלימה.</w:t>
+        <w:t xml:space="preserve">ת: בשקט. לא מדברים. אומרים המחלה. אלמרד. לא אומרים את השם. אם מישהו חולה אומרים אללה ישפיהו, שאללה ירפא אותו, וממשיכים לדבר על משהו אחר. על אום זיאד לא ידעתי כלום עד שהיא מתה. ידענו שהיא נוסעת לבאר שבע הרבה, ראינו את האוטו של הבן שלה יוצא בבוקר. שאלו אותה והיא אמרה בדיקות, סתם בדיקות. אחרי שנה השיער שלה נפל, אז כבר כולם הבינו, אבל אף אחד לא אמר את המילה בקול. גם הבנות שלה לא. ואחרי שהיא מתה, אז דיברו. אז פתאום כולם ידעו הכול. ואמרו גם דברים לא יפים, שהיא לא הלכה בזמן, שהיא הסתירה, שהיא הייתה עקשנית ולא שמעה לבן שלה. אישה מתה ועדיין מדברים עליה. שמעתי את זה במו אוזניי אצל השכנה ולא אמרתי מילה, ואני חושבת על זה עד היום. למה לא מדברים? כי מפחדים. ואולי בגלל הבנות, זאת האמת. תראי, אם אומרים על משפחה שיש בה את המחלה, אז כשבאים לשאול על בת, אנשים חושבים פעמיים. אומרים המשפחה הזאת חולה. זה לא הוגן, אני יודעת שזה לא הוגן, אבל ככה זה אצלנו ואני לא אשנה את זה. יש לי שתי בנות לא נשואות בבית. אז אישה חושבת על זה לפני שהיא פותחת את הפה. ויש עוד סיבה, אולי הכי חזקה. אצלנו כשאומרים את המילה הזאת זה כמו להגיד שהיא נגמרה. אנשים שומעים סרטן וישר חושבים כמה זמן נשאר לה, מי ייקח את הילדים. לא חושבים שיש טיפול. אני לא יודעת אם יש טיפול, בכנות. אני מכירה אחת שמתה. אני לא מכירה אף אחת שהחלימה.</w:t>
       </w:r>
     </w:p>
     <w:p>
@@ -6897,7 +6897,7 @@
           <w:szCs w:val="24"/>
           <w:rtl/>
         </w:rPr>
-        <w:t xml:space="preserve">ת: הכול מאללה, זה נכון. מי שנולד ומי שמת, זה כתוב, ואף אחד לא מזיז את זה. אני מאמינה בזה, זה לא ויכוח. אבל אני אגיד לך מה אני חושבת על נשים שאומרות ככה בשביל לא ללכת. אללה נתן גם את הרופאים. אם הוא לא היה רוצה שנתרפא, הוא לא היה שם תרופות בעולם. שמעתי את השיח' בג'אמע אומר שהנביא אמר תתרפאו, שאללה לא הוריד מחלה בלי שהוריד לה גם רפואה. את זה שמעתי במו אוזניי ואני זוכרת את זה עד היום. אז מי שיושבת בבית ואומרת מה שכתוב יהיה, היא לא מדייקת. כשהילד שלי היה עם ארבעים חום לא אמרתי מה שכתוב יהיה, רצתי איתו למרפאה בלילה ברגל. אז למה בשביל עצמי אני כן אומרת ככה? [שותקת] אני לא יודעת. אולי בשביל הילדים זה יותר קל כי אין שאלות, פשוט קמים והולכים. בשביל עצמי אני צריכה להחליט, ואישה לא רגילה להחליט על עצמה. ואולי גם קצת מפחדת ומשתמשת באללה בשביל לא לפחד. אני לא יודעת אם מותר להגיד דבר כזה בקול. תכתבי את זה בכל זאת. אני חושבת שאללה לא כועס על מי שהולכת לבדוק. אני חושבת שהוא כועס יותר על מי שיש לה משהו ומשאירה אותו ככה, ואחר כך תשעה ילדים נשארים בלי אמא.</w:t>
+        <w:t xml:space="preserve">ת: הכול מאללה, זה נכון. מי שנולד ומי שמת, זה כתוב, ואף אחד לא מזיז את זה. אני מאמינה בזה, זה לא ויכוח. אבל אני אגיד לך מה אני חושבת על נשים שאומרות ככה בשביל לא ללכת. אללה נתן גם את הרופאים. אם הוא לא היה רוצה שנתרפא, הוא לא היה שם תרופות בעולם. שמעתי את השיח' בג'אמע אומר שהנביא אמר תתרפאו, שאללה לא הוריד מחלה בלי שהוריד לה גם רפואה. את זה שמעתי במו אוזניי ואני זוכרת את זה עד היום. אז מי שיושבת בבית ואומרת מה שכתוב יהיה, היא לא מדייקת. כשהילד שלי היה עם ארבעים חום לא אמרתי מה שכתוב יהיה, רצתי איתו למרפאה בלילה ברגל. זה היה יוסף, הוא היה אז בן שנתיים, וסלמאן היה בעבודה ולא היה אוטו בחצר. אז למה בשביל עצמי אני כן אומרת ככה? [שותקת] אני לא יודעת. אולי בשביל הילדים זה יותר קל כי אין שאלות, פשוט קמים והולכים. בשביל עצמי אני צריכה להחליט, ואישה לא רגילה להחליט על עצמה. כל החיים או שמחליטים בשבילי או שאני מחליטה בשביל אחרים. ואולי גם קצת מפחדת ומשתמשת באללה בשביל לא לפחד. אני לא יודעת אם מותר להגיד דבר כזה בקול. תכתבי את זה בכל זאת. אני חושבת שאללה לא כועס על מי שהולכת לבדוק. אני חושבת שהוא כועס יותר על מי שיש לה משהו ומשאירה אותו ככה, ואחר כך תשעה ילדים נשארים בלי אמא.</w:t>
       </w:r>
     </w:p>
     <w:p>
@@ -6939,7 +6939,7 @@
           <w:szCs w:val="24"/>
           <w:rtl/>
         </w:rPr>
-        <w:t xml:space="preserve">ת: קופת חולים. יש לנו כללית, המרפאה בשכונה, לא רחוק, אני הולכת ברגל עשר דקות עם מוחמד ביד. שם זה בסדר, הפקידה מדברת ערבית, ופאא קוראים לה, היא בת של אחד השכנים, והיא מסבירה יפה. גם הרופא של הילדים מדבר ערבית קצת. אז שם אין בעיה של שפה. הבעיה מתחילה כשצריך לצאת מרהט. בסורוקה נתנו לי מספר, שמונים וארבע, וישבתי עם ראניה, וקראו מספרים ברמקול בעברית, ואני לא הבנתי מה קראו, ופספסתי. אחר כך אמרו לי התור שלך עבר, קחי מספר חדש. לקחתי חדש והתחלנו מהתחלה, ישבנו עוד שעתיים. מאז אני לא הולכת לשם בלי סלים, שהוא ישמע במקומי. כרטיס, את שואלת? יש כרטיס של הילדים, אני יודעת איפה הוא, בארנק של סלמאן. שלי, אני לא יודעת אם יש. אולי היה פעם. אני לא זוכרת שהחזקתי כרטיס ביד. תור אני לא יודעת לקחת לבד, אין לי אפליקציה, אין לי טלפון כזה, יש לי טלפון עם כפתורים ואני מרוצה ממנו. סנא לוקחת תור מהטלפון שלה כשצריך לילדים. אצלי אף פעם לא היה צורך אז אף פעם לא עשינו. והמכתבים, כמו שאמרתי לך, בעברית. אם היו שולחים בערבית זה כבר משהו אחר. ואם היו מצלצלים אליי ומדברים איתי, זה הכי טוב. אני עונה לטלפון תמיד.</w:t>
+        <w:t xml:space="preserve">ת: קופת חולים. יש לנו כללית, המרפאה בשכונה, לא רחוק, אני הולכת ברגל עשר דקות עם מוחמד ביד. שם זה בסדר, הפקידה מדברת ערבית, ופאא קוראים לה, היא בת של אחד השכנים, והיא מסבירה יפה. גם הרופא של הילדים מדבר ערבית קצת. אז שם אין בעיה של שפה. הבעיה מתחילה כשצריך לצאת מרהט. בסורוקה נתנו לי מספר, שמונים וארבע, וישבתי עם ראניה, וקראו מספרים ברמקול בעברית, ואני לא הבנתי מה קראו, ופספסתי. אחר כך אמרו לי התור שלך עבר, קחי מספר חדש. לקחתי חדש והתחלנו מהתחלה, ישבנו עוד שעתיים. מאז אני לא הולכת לשם בלי סלים, שהוא ישמע במקומי. והיחס, את שאלת על היחס. במרפאה פה היחס טוב, אני לא אתלונן על ופאא ולא על הרופא. בסורוקה הרגשתי שאני מפריעה. אחות אחת דיברה אליי חזק בעברית, כאילו אם היא תגיד את זה חזק יותר אני פתאום אבין. אני לא חירשת, אני פשוט לא יודעת את השפה. דבר כזה עושה לאישה משהו בבטן, ובפעם הבאה היא כבר לא רוצה ללכת לשם. כרטיס, את שואלת? יש כרטיס של הילדים, אני יודעת איפה הוא, בארנק של סלמאן. שלי, אני לא יודעת אם יש. אולי היה פעם. אני לא זוכרת שהחזקתי כרטיס ביד. תור אני לא יודעת לקחת לבד, אין לי אפליקציה, אין לי טלפון כזה, יש לי טלפון עם כפתורים ואני מרוצה ממנו. סנא לוקחת תור מהטלפון שלה כשצריך לילדים. אצלי אף פעם לא היה צורך אז אף פעם לא עשינו. והמכתבים, כמו שאמרתי לך, בעברית. אם היו שולחים בערבית זה כבר משהו אחר. ואם היו מצלצלים אליי ומדברים איתי, זה הכי טוב. אני עונה לטלפון תמיד.</w:t>
       </w:r>
     </w:p>
     <w:p>
@@ -7023,7 +7023,7 @@
           <w:szCs w:val="24"/>
           <w:rtl/>
         </w:rPr>
-        <w:t xml:space="preserve">ת: אום זיאד. נעימה. סיפרתי לך עליה קודם. היא גרה שני בתים מפה לכיוון הכביש. אישה טובה, הייתה אופה בטאבון ומביאה לנו לחם בחג בלי שביקשנו. הבן שלה זיאד עבד באילת ובא כל שבועיים. היא חלתה כשהייתה בת חמישים בערך, אולי חמישים ואחת. בהתחלה אמרו שיש לה משהו קטן, ניתחו אותה בסורוקה והוציאו. אחר כך היא חזרה הביתה וחשבנו שנגמר, ואפילו עשו קפה אצלה. אחרי כמה חודשים היא התחילה עם הטיפולים והשיער שלה נפל והיא כיסתה הכול במטפחת ולא יצאה מהבית. אנשים הפסיקו לבוא. לא מרוע, פשוט לא ידעו מה להגיד לה. אני הבאתי לה מרק פעמיים ואחר כך גם אני הפסקתי, ואני מתביישת בזה עד היום. היא מתה לפני שנתיים בקיץ, בת חמישים ושתיים. מה זה שינה אצלי? חשבתי שהיא הייתה בריאה ופתאום לא. חשבתי כמה זה מהר. [שותקת ארוכות] אני רוצה להגיד לך משהו ואני לא יודעת איך אומרים את זה. יש לי... אחרי החורף, כשהתקלחתי, מצאתי משהו. משהו קטן, פה, מהצד. כמו גרגר חומוס, אולי כמו גלעין. זה לא כואב. בכלל לא כואב, ולכן לא אמרתי כלום. אני בודקת אותו לפעמים בלילה כשכולם ישנים. לא סיפרתי לסלמאן, לא סיפרתי לעאיישה, לא סיפרתי לאף אחד. את הראשונה. [שותקת] תכתבי את זה, אבל שלא יידעו פה מי אמרה.</w:t>
+        <w:t xml:space="preserve">ת: אום זיאד. נעימה. סיפרתי לך עליה קודם. היא גרה שני בתים מפה לכיוון הכביש. אישה טובה, הייתה אופה בטאבון ומביאה לנו לחם בחג בלי שביקשנו. הבן שלה זיאד עבד באילת ובא כל שבועיים. היא חלתה כשהייתה בת חמישים בערך, אולי חמישים ואחת. בהתחלה אמרו שיש לה משהו קטן, ניתחו אותה בסורוקה והוציאו. אחר כך היא חזרה הביתה וחשבנו שנגמר, ואפילו עשו קפה אצלה. אחרי כמה חודשים היא התחילה עם הטיפולים והשיער שלה נפל והיא כיסתה הכול במטפחת ולא יצאה מהבית. אנשים הפסיקו לבוא. לא מרוע, פשוט לא ידעו מה להגיד לה. אני הבאתי לה מרק פעמיים ואחר כך גם אני הפסקתי, ואני מתביישת בזה עד היום. היא מתה לפני שנתיים בקיץ, בת חמישים ושתיים. מה זה שינה אצלי? חשבתי שהיא הייתה בריאה ופתאום לא. חשבתי כמה זה מהר. וגם חשבתי, אם היא לא ניצחה את זה, והיא הייתה חזקה ממני, אז מה יש לדבר בכלל. זה מה שחשבתי אז, ואני לא בטוחה שזה נכון, אבל זה מה שהיה לי בראש. [שותקת ארוכות] אני רוצה להגיד לך משהו ואני לא יודעת איך אומרים את זה. יש לי... אחרי החורף, כשהתקלחתי, מצאתי משהו. משהו קטן, פה, מהצד. כמו גרגר חומוס, אולי כמו גלעין. זה לא כואב. בכלל לא כואב, ולכן לא אמרתי כלום. אני בודקת אותו לפעמים בלילה כשכולם ישנים. לפעמים נדמה לי שהוא כבר לא שם ואני נרגעת, ואחרי יומיים אני מוצאת אותו שוב באותו מקום בדיוק. לא סיפרתי לסלמאן, לא סיפרתי לעאיישה, לא סיפרתי לאף אחד. את הראשונה. [שותקת] תכתבי את זה, אבל שלא יידעו פה מי אמרה.</w:t>
       </w:r>
     </w:p>
     <w:p>
@@ -7065,7 +7065,7 @@
           <w:szCs w:val="24"/>
           <w:rtl/>
         </w:rPr>
-        <w:t xml:space="preserve">ת: [שותקת] מה היה צריך לקרות. שמישהו יגיד לי. זהו, זה הכול. שמישהו יבוא ויגיד לי פאטמה, יש בדיקה כזאת, היא בשביל נשים בגיל שלך, עושים אותה במקום הזה והזה, אישה עושה אותה, זה לוקח כך וכך זמן, וזה עולה כך וכך או שזה לא עולה כלום, אני עוד לא יודעת מה נכון. שיגידו לי במילים פשוטות בערבית ולא בנייר. אני לא קוראת ניירות, ובערבית אני קוראת לאט. אם מצלצלים אליי אני עונה ואני מבינה הכול ואני יכולה לשאול שאלות. ואם הייתה באה אישה הביתה, אחות או מישהי מהמועצה, זה הכי טוב. פה בשכונה יש נשים שלא יוצאות בכלל, לא בגלל שאוסרים עליהן, פשוט לא יוצאות. ומה הייתי משנה? [חושבת] קודם כול שזה יהיה פה. ברהט, בשכונה, לא בבאר שבע. הקרוואן ההוא שראיתי ליד השוק, שיבוא כל חודש, ושיגידו קודם ברמקול של המסגד או שיעברו בבתים ויודיעו. כי אם זה פה, אז אני לא צריכה לבקש מאף אחד שייקח אותי, אני הולכת ברגל וחוזרת לפני שהילדים חוזרים ואף אחד לא צריך לדעת. זה כל ההבדל, את מבינה. בבאר שבע זה יום שלם ובקשה מהבעל ושאלות. פה זה חצי שעה. ודבר אחרון, שיהיה מקום שאישה יכולה לשאול שאלה בלי שכל היושבים שומעים אותה.</w:t>
+        <w:t xml:space="preserve">ת: [שותקת] מה היה צריך לקרות. שמישהו יגיד לי. זהו, זה הכול. שמישהו יבוא ויגיד לי פאטמה, יש בדיקה כזאת, היא בשביל נשים בגיל שלך, עושים אותה במקום הזה והזה, אישה עושה אותה, זה לוקח כך וכך זמן, וזה עולה כך וכך או שזה לא עולה כלום, אני עוד לא יודעת מה נכון. שיגידו לי במילים פשוטות בערבית ולא בנייר. אני לא קוראת ניירות, ובערבית אני קוראת לאט. אם מצלצלים אליי אני עונה ואני מבינה הכול ואני יכולה לשאול שאלות. ואם הייתה באה אישה הביתה, אחות או מישהי מהמועצה, זה הכי טוב. פה בשכונה יש נשים שלא יוצאות בכלל, לא בגלל שאוסרים עליהן, פשוט לא יוצאות. אישה כזאת לא תראה שום מודעה ולא תשמע שום דבר, וצריך שמישהי תדפוק לה בדלת ותשב איתה. ומה הייתי משנה? [חושבת] קודם כול שזה יהיה פה. ברהט, בשכונה, לא בבאר שבע. הקרוואן ההוא שראיתי ליד השוק, שיבוא כל חודש, ושיגידו קודם ברמקול של המסגד או שיעברו בבתים ויודיעו. כי אם זה פה, אז אני לא צריכה לבקש מאף אחד שייקח אותי, אני הולכת ברגל וחוזרת לפני שהילדים חוזרים ואף אחד לא צריך לדעת. זה כל ההבדל, את מבינה. בבאר שבע זה יום שלם ובקשה מהבעל ושאלות. פה זה חצי שעה. ודבר אחרון, שיהיה מקום שאישה יכולה לשאול שאלה בלי שכל היושבים שומעים אותה.</w:t>
       </w:r>
     </w:p>
     <w:p>
@@ -7107,7 +7107,7 @@
           <w:szCs w:val="24"/>
           <w:rtl/>
         </w:rPr>
-        <w:t xml:space="preserve">ת: אני? מה אני אגיד לאישה. אני לא יודעת כלום, שמעת בעצמך. אני יושבת פה שעה ואני עונה לך אני לא יודעת, אני לא יודעת. [מחייכת] אבל אם היא בגיל שלי ומתלבטת, אז היא כבר יודעת יותר ממני, כי היא בכלל יודעת שיש דבר כזה בעולם. אז הייתי אומרת לה תלכי. תלכי ותשאלי, גם אם את חוזרת בלי כלום, שאלת. אל תהיי כמוני שארבעים וארבע שנים לא שאלה כלום. ואם היא מפחדת מהתשובה, אני מבינה אותה, גם אני מפחדת, אבל הפחד לא נעלם כשיושבים איתו בבית. הוא רק גדל בשקט. את זה אני כבר יודעת. מה שאני רוצה שיישאר... שתכתבי שיש פה נשים שאף אחד לא דיבר איתן. לא שהן סירבו, לא שהן אמרו לא רוצה. לא דיברו איתן בכלל. אני לא אישה טיפשה, אני מנהלת בית עם תשעה ילדים ואני יודעת לחשוב ולהחליט. אם היו אומרים לי, הייתי מבינה. אף אחד לא אמר. תכתבי את זה בעבודה שלך, שיקראו את זה האנשים שיושבים במשרדים ומחליטים. ועוד דבר, מה שסיפרתי לך קודם, על הדבר הקטן, שיישאר גם, אבל בלי שיידעו פה מי זאת. ועכשיו את מבטיחה לי מה שאמרתי בהתחלה. תגידי לי מה זה ממוגרפיה ולאן הולכים. אני מכינה תה ואת מסבירה לי לאט, וסנא תשב ותשמע גם, שהיא תדע.</w:t>
+        <w:t xml:space="preserve">ת: אני? מה אני אגיד לאישה. אני לא יודעת כלום, שמעת בעצמך. אני יושבת פה שעה ואני עונה לך אני לא יודעת, אני לא יודעת. [מחייכת] אבל אם היא בגיל שלי ומתלבטת, אז היא כבר יודעת יותר ממני, כי היא בכלל יודעת שיש דבר כזה בעולם. אז הייתי אומרת לה תלכי. תלכי ותשאלי, גם אם את חוזרת בלי כלום, שאלת. אל תהיי כמוני שארבעים וארבע שנים לא שאלה כלום. ואם היא מפחדת מהתשובה, אני מבינה אותה, גם אני מפחדת, אבל הפחד לא נעלם כשיושבים איתו בבית. הוא רק גדל בשקט. את זה אני כבר יודעת. מה שאני רוצה שיישאר... שתכתבי שיש פה נשים שאף אחד לא דיבר איתן. לא שהן סירבו, לא שהן אמרו לא רוצה. לא דיברו איתן בכלל. אני לא אישה טיפשה, אני מנהלת בית עם תשעה ילדים ואני יודעת לחשוב ולהחליט. אם היו אומרים לי, הייתי מבינה. אף אחד לא אמר. ותכתבי גם שאני שאלתי אותך, שאישה בת ארבעים וארבע ישבה על המזרן ושאלה מה זה ולא התביישה לשאול. תכתבי את זה בעבודה שלך, שיקראו את זה האנשים שיושבים במשרדים ומחליטים. ועוד דבר, מה שסיפרתי לך קודם, על הדבר הקטן, שיישאר גם, אבל בלי שיידעו פה מי זאת. ועכשיו את מבטיחה לי מה שאמרתי בהתחלה. תגידי לי מה זה ממוגרפיה ולאן הולכים. אני מכינה תה ואת מסבירה לי לאט, וסנא תשב ותשמע גם, שהיא תדע.</w:t>
       </w:r>
     </w:p>
     <w:p>
@@ -7570,7 +7570,7 @@
           <w:szCs w:val="24"/>
           <w:rtl/>
         </w:rPr>
-        <w:t xml:space="preserve">ת: אצלנו לא אומרים את המילה. אומרים אלמרד, המחלה, וכולם מבינים. או אומרים המחלה הזאת, ומורידים את הקול, ומוסיפים בעיד עננא, רחוק מאיתנו. אישה מתה ואומרים עליה שהייתה חולה הרבה זמן. ילדים גדלים ולא יודעים מה היה לסבתא. אני, כשחליתי, הודעתי. לא עשיתי מזה הכרזה, אבל כשאישה שאלה אותי מה שלומך אמרתי לה יש לי גידול בשד, אני בטיפולים. ראיתי פנים משתנות מולי. יש כאלה שלא ידעו איפה לשים את העיניים. אחת אמרה לי מיד, אינשאללה תבריאי, ואז שינתה נושא באמצע המשפט לחתונה של מישהי. ואני חשבתי שזה יהיה יותר גרוע. באמת חשבתי. ציפיתי שיתרחקו ממני, שיפסיקו להזמין. ובפועל הבית שלי היה מלא. שכנות הביאו אוכל שלושה חודשים ברצף, מרק כל יום שני, נמאס לי מהמרק [מחייכת]. אבל הייתה גם אישה אחת. אני לא אגיד את השם, נקרא לה אם נידאל. היא אמרה לאישה אחרת, והאישה השנייה סיפרה לי אחרי חצי שנה, שראו את אמל מעשנת פעם ושזה מה שקורה. ושהיא בטח לא הלכה לבדיקות בזמן, ובאמת לא הלכתי, אבל היא לא ידעה את זה, היא סתם ניחשה. [שותקת] אני לא עישנתי מעולם. וזה כאב לי יותר מהכימותרפיה השלישית, ואני יודעת בדיוק כמה כאבה השלישית. ותשימי לב מה היא עשתה שם, כי זה מה שמפחיד נשים באמת. היא לא רק דיברה עליי. היא חיפשה סיבה. היא הייתה צריכה שיהיה לזה הסבר, שאמל עשתה משהו, כי אם אמל לא עשתה כלום אז זה יכול לקרות גם לה. ואני מבינה אותה היום. זה לא רוע, זה פחד שמחפש איפה לנחות. אבל בת שיושבת בסלון ושומעת את אמא שלה מדברת ככה על שכנה, מבינה מיד שאם זה יקרה לה ידברו גם עליה. ואז היא לא הולכת לבדוק. וככה זה עובר הלאה, בלי שאף אחד התכוון.</w:t>
+        <w:t xml:space="preserve">ת: אצלנו לא אומרים את המילה. אומרים אלמרד, המחלה, וכולם מבינים. או אומרים המחלה הזאת, ומורידים את הקול, ומוסיפים בעיד עננא, רחוק מאיתנו. אישה מתה ואומרים עליה שהייתה חולה הרבה זמן. ילדים גדלים ולא יודעים מה היה לסבתא. אני, כשחליתי, הודעתי. לא עשיתי מזה הכרזה, אבל כשאישה שאלה אותי מה שלומך אמרתי לה יש לי גידול בשד, אני בטיפולים. ראיתי פנים משתנות מולי. יש כאלה שלא ידעו איפה לשים את העיניים. אחת אמרה לי מיד, אינשאללה תבריאי, ואז שינתה נושא באמצע המשפט לחתונה של מישהי. ואני חשבתי שזה יהיה יותר גרוע. באמת חשבתי. ציפיתי שיתרחקו ממני, שיפסיקו להזמין. ובפועל הבית שלי היה מלא. שכנות הביאו אוכל שלושה חודשים ברצף, מרק כל יום שני, נמאס לי מהמרק [מחייכת]. אבל הייתה גם אישה אחת, נקרא לה אם נידאל. היא אמרה לאישה אחרת, והאישה השנייה סיפרה לי אחרי חצי שנה, שראו את אמל מעשנת פעם ושזה מה שקורה. ושהיא בטח לא הלכה לבדיקות בזמן, ובאמת לא הלכתי, אבל היא לא ידעה את זה, היא סתם ניחשה. [שותקת] אני לא עישנתי מעולם. וזה כאב לי יותר מהכימותרפיה השלישית, ואני יודעת בדיוק כמה כאבה השלישית. ותשימי לב מה היא עשתה שם, כי זה מה שמפחיד נשים באמת. היא לא רק דיברה עליי. היא חיפשה סיבה. היא הייתה צריכה שיהיה לזה הסבר, שאמל עשתה משהו, כי אם אמל לא עשתה כלום אז זה יכול לקרות גם לה. ואני מבינה אותה היום. זה לא רוע, זה פחד שמחפש איפה לנחות. אבל בת שיושבת בסלון ושומעת את אמא שלה מדברת ככה על שכנה, מבינה מיד שאם זה יקרה לה ידברו גם עליה. ואז היא לא הולכת לבדוק. וככה זה עובר הלאה, בלי שאף אחד התכוון.</w:t>
       </w:r>
     </w:p>
     <w:p>
@@ -7654,7 +7654,7 @@
           <w:szCs w:val="24"/>
           <w:rtl/>
         </w:rPr>
-        <w:t xml:space="preserve">ת: אני רוצה להגיד לך משהו לפני שאני עונה. על השאלה הזאת אני מסרבת לענות בתור עובדת סוציאלית. יש לי תשובה מקצועית מוכנה, אני נותנת אותה בהרצאות, היא נכונה והיא לא שווה כלום פה. אני אענה לך בתור אמל. אני מאמינה. אני מתפללת חמש פעמים ביום ואני מאמינה שהיום שלי כתוב. וכן, כשהייתי בטיפולים זה החזיק אותי. לשכב שם עם האינפוזיה ולהגיד בלב שזה לא מקרי, שיש לזה בעל בית, זה נתן לי שקט שאף כדור הרגעה לא נתן. אבל מה שעשיתי באותה שנה וחצי, זה לא היה אמונה. אני אומרת את זה בפה מלא. אני לקחתי את האמונה ולבשתי אותה על הפחד כמו שמיכה. הייתי אומרת לעצמי בלילה, מה שכתוב יהיה, ואז הייתי נרדמת, ובבוקר לא הייתי מרימה טלפון לקופה. זאת לא אמונה, זאת עסקה שעשיתי עם עצמי. הנביא, עליו השלום, אמר לאיש שבא ואמר לו אני משחרר את הגמל וסומך על אללה, אמר לו קשור את הגמל ואז תסמוך. את הסיפור הזה אני מספרת עכשיו בכל קבוצה, וגם השיח' אמר לי אותו. ואני מוסיפה להן שאללה נתן לנו את המכשיר הזה ואת הבדיקה החינם, וזה גם כתוב, גם זה חלק ממה שנכתב. אישה אחת ענתה לי, יא אמל, את מתווכחת יפה. לא הלכה. הלכה שנה אחר כך. ואני רוצה להזהיר אותך ממשהו, כי אני קוראת דברים שכותבים עלינו. כותבים שהאמונה מעכבת נשים מלהיבדק, ואז יוצא שהדת היא האשמה. זה לא מדויק ואני לא מוכנה לזה. אני לא פגשתי בטייבה אישה אחת שאמרה לי אסור לי ללכת. אף אחת. פגשתי נשים שמפחדות ומשתמשות במילים של דת כדי לתאר את הפחד, כי אלה המילים היפות שיש להן. ומי שלא מבין את ההבדל הזה מתווכח איתן על אללה במקום לדבר על מה שבאמת מחזיק אותן בבית.</w:t>
+        <w:t xml:space="preserve">ת: אני רוצה להגיד לך משהו לפני שאני עונה. על השאלה הזאת אני מסרבת לענות בתור עובדת סוציאלית. יש לי תשובה מקצועית מוכנה שאני נותנת בהרצאות, היא נכונה והיא לא שווה כלום פה. אני אענה לך בתור אמל. אני מאמינה. אני מתפללת חמש פעמים ביום ואני מאמינה שהיום שלי כתוב. וכן, כשהייתי בטיפולים זה החזיק אותי. לשכב שם עם האינפוזיה ולהגיד בלב שזה לא מקרי, שיש לזה בעל בית, זה נתן לי שקט שאף כדור הרגעה לא נתן. אבל מה שעשיתי באותה שנה וחצי, זה לא היה אמונה. אני אומרת את זה בפה מלא. אני לקחתי את האמונה ולבשתי אותה על הפחד כמו שמיכה. הייתי אומרת בלילה, מה שכתוב יהיה, ואז נרדמת, ובבוקר לא מרימה טלפון לקופה. זאת לא אמונה, זאת עסקה שעשיתי עם עצמי. הנביא, עליו השלום, אמר לאיש שבא ואמר לו אני משחרר את הגמל וסומך על אללה, אמר לו קשור את הגמל ואז תסמוך. את הסיפור הזה אני מספרת עכשיו בכל קבוצה, וגם השיח' אמר לי אותו. ואני מוסיפה להן שאללה נתן לנו את המכשיר הזה ואת הבדיקה החינם, וזה גם כתוב, גם זה חלק ממה שנכתב. אישה אחת ענתה לי, יא אמל, את מתווכחת יפה. לא הלכה. הלכה שנה אחר כך. ואני רוצה להזהיר אותך ממשהו, כי אני קוראת דברים שכותבים עלינו. כותבים שהאמונה מעכבת נשים מלהיבדק, ואז יוצא שהדת היא האשמה. זה לא מדויק ואני לא מוכנה לזה. אני לא פגשתי בטייבה אישה אחת שאמרה לי אסור לי ללכת. אף אחת. פגשתי נשים שמפחדות ומשתמשות במילים של דת כדי לתאר את הפחד, כי אלה המילים היפות שיש להן. ומי שלא מבין את ההבדל הזה מתווכח איתן על אללה במקום לדבר על מה שבאמת מחזיק אותן בבית.</w:t>
       </w:r>
     </w:p>
     <w:p>
@@ -7696,7 +7696,7 @@
           <w:szCs w:val="24"/>
           <w:rtl/>
         </w:rPr>
-        <w:t xml:space="preserve">ת: המרפאה שלי היא בטייבה, מאה מטר מהבית כמעט, אני הולכת ברגל. אבל הממוגרפיה היא לא שם, היא בכפר סבא, במכון, בערך תשעה עשר קילומטר. לי יש רישיון ויש אוטו, וזה מיעוט פה בגיל שלי. רוב הנשים בקבוצה שלי לא נוהגות. אז ללכת לבדיקה זה אומר לבקש מהבן שייקח יום, או לחכות לשבת שהוא פנוי, ואז המכון סגור בשבת. זה כל הסיפור בשתי שורות. הזימונים הגיעו אליי בעברית. מכתב, לוגו, כתוב את מוזמנת לבצע בדיקת ממוגרפיה. אני קוראת עברית מצוין, אז לי זה לא הפריע, אבל אני זוכרת שאישה הביאה לי פעם מכתב כזה למשרד ושאלה אותי אם זה מהביטוח לאומי. היא חשבה שזה בקשר לקצבה. הייתה גם שיחה מוקלטת פעם אחת, בעברית, ואם לא לוחצים אחת זה מתנתק. התור עצמו לא היה נורא, שלושה שבועות בערך, ואחרי שהייתה כבר הפניה עם גוש קיבלתי תוך ארבעה ימים. היחס במכון היה בסדר גמור, אני לא אגיד מילה רעה. הפקידה בקבלה אמרה לי גברת סרחאן תשבי, נקרא לך, זה לוקח זמן, יש היום עומס. מנומסת. אבל היא אמרה לי את זה בעברית, ולידי ישבה אישה מכפר קאסם עם מטפחת שלא הבינה שקוראים בשמה, וכשקראו לה פעמיים והיא לא קמה, עברו לבאה אחריה. אני קמתי ואמרתי לה בערבית שקראו לה. היא הודתה לי כאילו הצלתי אותה. ואני חושבת על זה עד היום, כי עבדתי עשרים ושמונה שנה במערכת ציבורית ואני יודעת שאף אחד שם לא רוצה רע. הפקידה לא אשמה, היא קראה שם מהמסך. פשוט אין שם אף אחד שהתפקיד שלו לראות את האישה הזאת. יש מי שקורא שמות ויש מי שמצלם ויש מי שכותב תשובה, ובין כל אלה נופלות נשים, ואף אחד לא סופר אותן כי הן לא הגיעו, ומי שלא הגיע לא קיים בשום דוח.</w:t>
+        <w:t xml:space="preserve">ת: המרפאה שלי בטייבה, מאה מטר מהבית, אני הולכת ברגל. אבל הממוגרפיה לא שם, היא בכפר סבא, בערך תשעה עשר קילומטר. לי יש רישיון ויש אוטו, וזה מיעוט פה בגיל שלי. רוב הנשים בקבוצה שלי לא נוהגות. אז ללכת לבדיקה זה אומר לבקש מהבן שייקח יום, או לחכות לשבת שהוא פנוי, ואז המכון סגור בשבת. זה כל הסיפור בשתי שורות. הזימונים הגיעו אליי בעברית. מכתב, לוגו, כתוב את מוזמנת לבצע בדיקת ממוגרפיה. אני קוראת עברית מצוין, אז לי זה לא הפריע, אבל אני זוכרת שאישה הביאה לי פעם מכתב כזה למשרד ושאלה אותי אם זה מהביטוח לאומי. היא חשבה שזה בקשר לקצבה. הייתה גם שיחה מוקלטת אחת, בעברית, ואם לא לוחצים אחת זה מתנתק. התור עצמו לא היה נורא, שלושה שבועות בערך, ואחרי שהייתה כבר הפניה עם גוש קיבלתי תוך ארבעה ימים. היחס במכון היה בסדר גמור, אני לא אגיד מילה רעה. הפקידה בקבלה אמרה לי גברת סרחאן תשבי, נקרא לך, זה לוקח זמן, יש היום עומס. מנומסת. אבל היא אמרה לי את זה בעברית, ולידי ישבה אישה מכפר קאסם עם מטפחת שלא הבינה שקוראים בשמה, וכשקראו לה פעמיים והיא לא קמה, עברו לבאה אחריה. אני קמתי ואמרתי לה בערבית שקראו לה. היא הודתה לי כאילו הצלתי אותה. ואני חושבת על זה עד היום, כי עבדתי עשרים ושמונה שנה במערכת ציבורית ואני יודעת שאף אחד שם לא רוצה רע. הפקידה לא אשמה, היא קראה שם מהמסך. פשוט אין שם אף אחד שהתפקיד שלו לראות את האישה הזאת. יש מי שקורא שמות ויש מי שמצלם ויש מי שכותב תשובה, ובין כל אלה נופלות נשים, ואף אחד לא סופר אותן כי הן לא הגיעו, ומי שלא הגיע לא קיים בשום דוח.</w:t>
       </w:r>
     </w:p>
     <w:p>
@@ -7822,7 +7822,7 @@
           <w:szCs w:val="24"/>
           <w:rtl/>
         </w:rPr>
-        <w:t xml:space="preserve">ת: שמישהי הייתה מתקשרת אליי בשמי ואומרת לי, אמל, קבעתי לך ליום רביעי, את יכולה? ואם הייתי אומרת לא, שתגיד, אז מתי. שיהיה לזה בעל בית מהצד השני. זה הדבר האחד. מכתב הוא לא בעל בית, מכתב זאת נייר שאני מחליטה מה לעשות איתה, ואני, כשאני מפחדת, מחליטה לא נכון. ותשאלי אותי גם מה לא עובד, כי בזה אני מתעסקת ארבע שנים. הרצאה במתנ"ס לא עובדת. עשיתי כמה כאלה בהתחלה. הכינו לי אולם עם שישים כיסאות, שמו כיבוד, תלו שלט. הגיעו אחת עשרה נשים, וארבע מהן היו מהעמותה. למה זה נכשל? כי מי שרואה אישה נכנסת לאולם הזה יודע שהיא באה לשמוע על סרטן. היא מסמנת את עצמה. וגם בפנים היא לא תרים יד ולא תשאל את השאלה האמיתית שלה מול שישים כיסאות. מה שכן עובד זה סלון. עשר נשים אצל פתחייה בבית, על הרצפה עם קפה, אני בלי מצגת ובלי כלום, מחזיקה כוס. שם אישה שואלת אותי אם נכון שהבדיקה עצמה גורמת לסרטן מהקרינה, כי באולם היא תתבייש לשאול. ושם, כשאחת אומרת אני הלכתי והיה בסדר, השנייה מסתכלת עליה ולא עליי, ואת השנייה זה מזיז. ודבר אחרון. השיח' עבד אלרחים, ממסגד בכפר קאסם, אדם מבוגר. הלכתי אליו עם עוד אישה מהעמותה, שתינו קפה במשרד שלו, והוא היה זהיר איתנו בהתחלה. לא ביקשנו הרצאה על סרטן, אלוהים ישמור, זה היה נכשל. ביקשנו משפט. והוא אמר בדרשת יום שישי, אחרי שדיבר על שמירה על הנפש, שהטיפול והבדיקה הם ממה שציווה עלינו הבורא, ושמי שדוחה בדיקה לא סומך על אללה אלא מזניח את מה שהופקד בידיו. שתי דקות מתוך דרשה של עשרים. באותו שבוע, ובשבוע שאחריו, קיבלנו אחת עשרה פניות של נשים לקבוצה בכפר קאסם. אחת עשרה. ואת יודעת מה היה הכי מעניין? רובן שמעו את זה מהבעל בארוחת הצהריים, לא במסגד. הן בכלל לא היו שם.</w:t>
+        <w:t xml:space="preserve">ת: שמישהי הייתה מתקשרת אליי בשמי ואומרת לי, אמל, קבעתי לך ליום רביעי, את יכולה? ואם הייתי אומרת לא, שתגיד, אז מתי. שיהיה לזה בעל בית מהצד השני. זה הדבר האחד. מכתב הוא לא בעל בית, מכתב זאת נייר שאני מחליטה מה לעשות איתה, ואני, כשאני מפחדת, מחליטה לא נכון. ותשאלי אותי גם מה לא עובד, בזה אני מתעסקת ארבע שנים. הרצאה במתנ"ס לא עובדת. עשיתי כמה בהתחלה. הכינו אולם עם שישים כיסאות, שמו כיבוד, תלו שלט. הגיעו אחת עשרה נשים, וארבע מהן היו מהעמותה. למה זה נכשל? כי מי שרואה אישה נכנסת לאולם הזה יודע שהיא באה לשמוע על סרטן. היא מסמנת את עצמה. וגם בפנים היא לא תרים יד ולא תשאל את השאלה האמיתית שלה מול שישים כיסאות. מה שכן עובד זה סלון. עשר נשים אצל פתחייה בבית, על הרצפה עם קפה, אני בלי מצגת, מחזיקה כוס. שם אישה שואלת אותי אם נכון שהבדיקה עצמה גורמת לסרטן מהקרינה, כי באולם היא תתבייש לשאול. ושם, כשאחת אומרת אני הלכתי והיה בסדר, השנייה מסתכלת עליה ולא עליי, ואת השנייה זה מזיז. ודבר אחרון. השיח' עבד אלרחים, ממסגד בכפר קאסם, אדם מבוגר. הלכתי אליו עם עוד אישה מהעמותה, שתינו קפה במשרד שלו, והוא היה זהיר בהתחלה. לא ביקשנו הרצאה על סרטן, אלוהים ישמור, זה היה נכשל. ביקשנו משפט. והוא אמר בדרשת יום שישי, אחרי שדיבר על שמירת הנפש, שהבדיקה היא ממה שציווה עלינו הבורא, ושמי שדוחה אותה לא סומך על אללה אלא מזניח את מה שהופקד בידיו. שתי דקות מתוך דרשה של עשרים. באותו שבוע, ובשבוע שאחריו, קיבלנו אחת עשרה פניות של נשים לקבוצה בכפר קאסם. אחת עשרה. והכי מעניין, רובן שמעו את זה מהבעל בארוחת הצהריים. הן בכלל לא היו שם.</w:t>
       </w:r>
     </w:p>
     <w:p>
@@ -7864,7 +7864,7 @@
           <w:szCs w:val="24"/>
           <w:rtl/>
         </w:rPr>
-        <w:t xml:space="preserve">ת: [שותקת] אני לא אגיד לה תלכי, זה שום דבר, זה עשר דקות. את זה אומרים לה כבר עשרים שנה ומשהו וזה לא עבד. אני אשאל אותה מתי היא מתכננת ללכת. לא אם, מתי. ואם היא תגיד אחרי החג, אני אגיד לה, טוב, החג נגמר בשלישי, אני אתקשר אלייך ברביעי בבוקר, ואני אתקשר. ואם היא תגיד לי שהיא מפחדת, אני לא אגיד לה שאין ממה לפחד, כי יש. אני אגיד לה, אני פחדתי שנה וחצי, וזאת השנה וחצי שהכי יקרה לי היום, כי מה שהיה אצלי קטן היה יכול להישאר קטן. מה שאני רוצה שיישאר. [שותקת] תראי, אני ידעתי הכול. אני חילקתי את העלונים. אני שלחתי נשים אחרות. אני יושבת מולך היום ומדריכה קבוצות ומדברת במסגדים, ואני, עם התואר ועם עשרים ושמונה שנות עבודה, נגעתי בגוש הזה כל לילה במשך שנה וחצי ולא זזתי. אז אם מישהו קורא את זה וחושב שהנשים אצלנו לא הולכות כי הן לא יודעות, שיכתוב שהוא טועה. הן יודעות. הידיעה לא מזיזה את הרגליים. מה שמזיז את הרגליים זה שיש מישהו שמחכה לך בצד השני ושואל למה לא באת. וזה, לצערי, זה הדבר היחיד שלא בנו במערכת הזאת. ועוד דבר אחד. אני לא רוצה שיישאר מזה שאני סיפור הצלחה. אני מכירה את הז'אנר, מביאים את המחלימה שתעודד את כולן. אני לא באתי לעודד אף אחת. אני עדיין כועסת על עצמי ואני לא בטוחה שזה צריך לעבור. מה שכן, אני כבר לא מבקשת מעצמי הסבר. ניסיתי שנתיים להבין למה חיכיתי, וכל התשובות שנתתי לך היום נכונות וכולן לא מספיקות. בסוף אישה יכולה לדעת דבר ולעשות ההפך, וזה לא הופך אותה לטיפשה. זה רק הופך אותה לבן אדם. תכתבי את זה, בבקשה. הרבה נשים יקראו את זה ויירגע להן קצת בלב.</w:t>
+        <w:t xml:space="preserve">ת: [שותקת] אני לא אגיד לה תלכי, זה שום דבר, זה עשר דקות. את זה אומרים לה כבר עשרים שנה ומשהו וזה לא עבד. אני אשאל אותה מתי היא מתכננת ללכת. לא אם, מתי. ואם היא תגיד אחרי החג, אני אגיד לה, טוב, החג נגמר בשלישי, אני אתקשר אלייך ברביעי בבוקר, ואני אתקשר. ואם היא תגיד לי שהיא מפחדת, אני לא אגיד לה שאין ממה לפחד, כי יש. אני אגיד לה, אני פחדתי שנה וחצי, וזאת השנה וחצי שהכי יקרה לי היום, כי מה שהיה אצלי קטן היה יכול להישאר קטן. מה שאני רוצה שיישאר. [שותקת] תראי, אני ידעתי הכול. אני חילקתי את העלונים. אני שלחתי נשים אחרות. אני יושבת מולך היום ומדריכה קבוצות ומדברת במסגדים, ואני, עם התואר ועם עשרים ושמונה שנות עבודה, נגעתי בגוש הזה כל לילה במשך שנה וחצי ולא זזתי. אז אם מישהו קורא את זה וחושב שהנשים אצלנו לא הולכות כי הן לא יודעות, שיכתוב שהוא טועה. הן יודעות. הידיעה לא מזיזה את הרגליים. מה שמזיז את הרגליים זה שיש מישהו שמחכה לך בצד השני ושואל למה לא באת. וזה, לצערי, זה הדבר היחיד שלא בנו במערכת הזאת. ועוד דבר אחד. אני לא רוצה שיישאר מזה שאני סיפור הצלחה. אני מכירה את הז'אנר, מביאים את המחלימה שתעודד את כולן. אני לא באתי לעודד. אני עדיין כועסת על עצמי ואני לא בטוחה שזה צריך לעבור. מה שכן, אני כבר לא מבקשת מעצמי הסבר. ניסיתי שנתיים להבין למה חיכיתי, וכל התשובות שנתתי לך היום נכונות וכולן לא מספיקות. בסוף אישה יכולה לדעת דבר ולעשות ההפך, וזה לא הופך אותה לטיפשה, זה הופך אותה לבן אדם. תכתבי את זה, בבקשה. הרבה נשים יקראו את זה ויירגע להן קצת בלב.</w:t>
       </w:r>
     </w:p>
     <w:p>
@@ -8916,7 +8916,7 @@
           <w:szCs w:val="24"/>
           <w:rtl/>
         </w:rPr>
-        <w:t xml:space="preserve">ת: עשיתי פעם אחת. בגיל חמישים ואחת. בחרנו יום שלישי כי שלישי הוא יום חלש בשוק, אנשים קונים ראשון וחמישי. וגם שלישי אין הסעה של אמא, לא, רגע, שלישי כן יש. [מתקנת את עצמה] שלישי יש, אז היבה לקחה חופש מהגן בשביל להיות עם אמא. את רואה כמה אנשים זזו בשביל בוקר אחד. יצאנו מהדוכן בתשע ורבע, אבו מוחמד סגר את הבד ושם משקולות. נסענו לראשון לציון, למכון, בערך עשרים וחמש דקות בטנדר. חיפשנו חנייה תשע דקות. שילמנו עשרים ושישה שקל על החנייה, אני זוכרת בדיוק כי הוא אמר לי עשרים ושישה שקל על שום דבר. נכנסתי, לקחתי מספר, חיכיתי ארבעים דקות בערך. הייתה שם אישה מבוגרת שדיברה איתי ערבית, מרמלה, וזה עשה לי טוב. קראו לי. נתנו לי חדר קטן להתפשט ושקית לשים בה את החולצה, ועל השקית היה מדבקה עם השם שלי, וכתבו סאמח עם אלף במקום סמאח. שטות, אבל אני זוכרת. הייתה טכנאית, אישה, בחורה צעירה, אולי בת שלושים. היא לא דיברה הרבה. היא אמרה תורידי, תעמדי פה, תתקרבי, תנשמי, אל תזוזי. ארבע פעמים. זה לחץ. זה כמו לתפוס את האצבע בדלת, שנייה וזה עובר. ארבע דקות וזה נגמר. הכול ביחד בפנים אולי עשר דקות. חזרנו לשוק בשתיים עשרה וחמישים, וזה כבר לא שווה לפתוח, אז פתחנו בכל זאת ועמדנו שעה. תעשי חשבון. יום בשוק זה שלוש מאות עד חמש מאות לשנינו, נטו, אחרי הסחורה. אז חצי יום זה מאתיים, ועוד עשרים ושישה חנייה, ועוד סולר. מאתיים וחמישים שקל יצא לי הבוקר הזה. אחרי שלושה שבועות הגיע מכתב שכתוב בו ללא ממצא. חיכיתי לו? לא במיוחד. לא ישבתי ולא ספרתי ימים, היה לי שבוע של אבטיחים. את המכתב הזה שמרתי, הוא בארון עד היום, בתיקייה עם התעודות של רמי. ואת יודעת מה קרה אחרי זה? כלום. אף אחד לא התקשר להגיד לי מתי הבא. אף אחד.</w:t>
+        <w:t xml:space="preserve">ת: עשיתי פעם אחת. בגיל חמישים ואחת. בחרנו יום שלישי כי שלישי הוא יום חלש בשוק, אנשים קונים ראשון וחמישי. וגם שלישי אין הסעה של אמא, לא, רגע, שלישי כן יש. [מתקנת את עצמה] שלישי יש, אז היבה לקחה חופש מהגן בשביל להיות עם אמא. את רואה כמה אנשים זזו בשביל בוקר אחד. יצאנו מהדוכן בתשע ורבע, אבו מוחמד סגר את הבד ושם משקולות. נסענו לראשון לציון, למכון, בערך עשרים וחמש דקות בטנדר. חיפשנו חנייה תשע דקות. שילמנו עשרים ושישה שקל על החנייה, אני זוכרת בדיוק כי הוא אמר לי עשרים ושישה שקל על שום דבר. נכנסתי, לקחתי מספר, חיכיתי ארבעים דקות בערך. הייתה שם אישה מבוגרת שדיברה איתי ערבית, מרמלה, וזה עשה לי טוב. קראו לי. נתנו לי חדר קטן להתפשט ושקית עם מדבקה, וכתבו עליה סאמח באלף במקום סמאח. שטות, אבל אני זוכרת. הטכנאית הייתה אישה, בחורה צעירה, בת שלושים אולי. היא לא דיברה הרבה. תורידי, תעמדי פה, תתקרבי, תנשמי, אל תזוזי. ארבע פעמים. זה לוחץ. זה כמו לתפוס את האצבע בדלת, שנייה וזה עובר. הכול ביחד בפנים עשר דקות. חזרנו לשוק בשתיים עשרה וחמישים, וזה כבר לא שווה לפתוח, אז פתחנו בכל זאת ועמדנו שעה. תעשי חשבון. יום בשוק זה שלוש מאות עד חמש מאות לשנינו, נטו, אחרי הסחורה. אז חצי יום זה מאתיים, ועוד עשרים ושישה חנייה, ועוד סולר. מאתיים וחמישים שקל יצא לי הבוקר הזה. אחרי שלושה שבועות הגיע מכתב שכתוב בו ללא ממצא. חיכיתי לו? לא ישבתי וספרתי ימים, היה לי שבוע של אבטיחים. את המכתב הזה שמרתי, הוא בארון עד היום, בתיקייה עם התעודות של רמי. ואת יודעת מה קרה אחרי זה? כלום. אף אחד לא התקשר להגיד לי מתי הבא. אף אחד.</w:t>
       </w:r>
     </w:p>
     <w:p>
@@ -9252,7 +9252,7 @@
           <w:szCs w:val="24"/>
           <w:rtl/>
         </w:rPr>
-        <w:t xml:space="preserve">ת: לא באמת. ד"ר סעדי הזכיר. פעם אחת, אולי פעמיים. באתי אליו על הלחץ דם, והוא הסתכל במסך והקליד ואמר לי סמאח, יש לך מכתב לממוגרפיה, למה לא הלכת. ככה, תוך כדי הקלדה, בלי להרים את הראש. אמרתי לו אינשאללה. הוא אמר טוב, והמשיך למרשם. וזהו. זה נגמר שם. אני לא כועסת עליו, יש לו תור של שבע דקות ויש בחוץ עשרים אנשים. פעם אחת אחות במרפאה, ראידה קוראים לה, נתנה לי דף. דף מודפס עם תמונה. לקחתי, אמרתי תודה, שמתי בתיק. את הדף הזה זרקתי אחרי חודשיים כשניקיתי את התיק. [שותקת] אני חושבת שאם מישהו היה מסתכל עליי בעיניים ואומר לי סמאח, את, לא כולן, את, תעשי את זה, ואז מרים טלפון באותו רגע וקובע לי תור ואומר לי הנה, יש לך שלישי הבא בשבע וחצי בבוקר, קחי פתק, אני חושבת שהייתי הולכת. באמת. כי אז זה כבר קיים. זה כבר תור. משהו שיש לו תאריך אני מכבדת, אני לא מבטלת דברים. אבל להגיד לי לכי תקבעי, זה נופל עליי ואני כבר עמוסה, וזה נכנס לרשימה של הדברים שאני אעשה כשיהיה לי זמן. ואין לי זמן. אז זה נשאר שם שש שנים.</w:t>
+        <w:t xml:space="preserve">ת: לא באמת. ד"ר סעדי הזכיר. פעם אחת, אולי פעמיים. באתי אליו על הלחץ דם, והוא הסתכל במסך והקליד ואמר לי סמאח, יש לך מכתב לממוגרפיה, למה לא הלכת. ככה, תוך כדי הקלדה, בלי להרים את הראש. אמרתי לו אינשאללה. הוא אמר טוב, והמשיך למרשם. וזהו. זה נגמר שם. אני לא כועסת עליו, יש לו תור של שבע דקות ויש בחוץ עשרים אנשים. פעם אחת אחות במרפאה, ראידה קוראים לה, נתנה לי דף. דף מודפס עם תמונה. לקחתי, אמרתי תודה, שמתי בתיק. את הדף הזה זרקתי אחרי חודשיים כשניקיתי את התיק. וגם היה פעם דוכן בשוק, של איזה ארגון, בחורות צעירות עם חולצות ורודות ובלונים, מדדו לחץ דם בחינם. באו אליי, מדדו לי, אמרו לי גבוה קצת. שאלתי אותן על הממוגרפיה והן נתנו לי עלון וחייכו. הן היו נחמדות. הן עמדו שם יומיים ונעלמו. [שותקת] אני חושבת שאם מישהו היה מסתכל עליי בעיניים ואומר לי סמאח, את, לא כולן, את, תעשי את זה, ואז מרים טלפון באותו רגע וקובע לי תור ואומר לי הנה, יש לך שלישי הבא בשבע וחצי בבוקר, קחי פתק, אני חושבת שהייתי הולכת. באמת. כי אז זה כבר קיים. זה כבר תור. משהו שיש לו תאריך אני מכבדת, אני לא מבטלת דברים. אבל להגיד לי לכי תקבעי, זה נופל עליי ואני כבר עמוסה, וזה נכנס לרשימה של הדברים שאני אעשה כשיהיה לי זמן. ואין לי זמן. אז זה נשאר שם שש שנים.</w:t>
       </w:r>
     </w:p>
     <w:p>
@@ -9294,7 +9294,7 @@
           <w:szCs w:val="24"/>
           <w:rtl/>
         </w:rPr>
-        <w:t xml:space="preserve">ת: אום אשרף. מהשוק, הדוכן שלה שלושה דוכנים ממני, זיתים וחמוצים ולבנה. היא הייתה בת ארבעים ותשע, זה היה לפני שנתיים וחצי בערך. היא מצאה לבד, במקלחת. היא סיפרה לי את זה בעצמה, היא אמרה סמאח, הרגשתי משהו קטן כמו חומוס, וישר בשבוע הזה הלכתי. היא לא חיכתה. עשו לה ניתוח באסף, הורידו את הגוש ולא את כל השד, ואחר כך היה לה טיפולים, אני חושבת שמונה. היא הפסידה חודשים בשוק והבן שלה עמד בדוכן במקומה, בחור בן עשרים, לא ידע להבדיל בין זיתים לזיתים. [צוחקת] היא חזרה. היא היום עומדת שם, יש לה מטפחת אחרת עכשיו. היא בסדר, ברוך השם. מה זה עשה לי? עשה לי משהו, אני לא אשקר. שבועיים חשבתי על זה כל בוקר. אמרתי לעצמי סמאח את בת חמישים וחמש ואת לא הלכת מאז. אפילו אמרתי לאבו מוחמד, ואמרתי לו בקול, אמרתי תיקח אותי אחרי החגים. והוא אמר בסדר. ואז החגים עברו, ואז אמא נפלה, וזה נגמר. [שותקת] תשמעי, זה מה שאני לא מצליחה להסביר. אני לא שכחתי. אני זוכרת את זה כל הזמן, זה יושב לי כאן מאחורה. פשוט כל בוקר יש בוקר אחר שדוחף אותו. אני לא אישה ששוכחת. אני אישה שאין לה יום פנוי.</w:t>
+        <w:t xml:space="preserve">ת: אום אשרף. מהשוק, הדוכן שלה שלושה דוכנים ממני, זיתים וחמוצים ולבנה. היא הייתה בת ארבעים ותשע, זה היה לפני שנתיים וחצי בערך. היא מצאה לבד, במקלחת. היא סיפרה לי את זה בעצמה, היא אמרה סמאח, הרגשתי משהו קטן כמו חומוס, וישר בשבוע הזה הלכתי. היא לא חיכתה. עשו לה ניתוח באסף, הורידו את הגוש ולא את כל השד, ואחר כך היה לה טיפולים, אני חושבת שמונה. היא הפסידה חודשים בשוק והבן שלה עמד בדוכן במקומה, בחור בן עשרים, לא ידע להבדיל בין זיתים לזיתים. [צוחקת] היא חזרה. היא היום עומדת שם, יש לה מטפחת אחרת עכשיו. היא בסדר, ברוך השם. היא אמרה לי משפט אחד שנתקע לי. היא אמרה סמאח, אני לא מפחדת מהמחלה, אני מפחדת מהיום שאני לא אעמוד בדוכן. זה מה שהיא אמרה. אישה מהשוק מפחדת מדברים של שוק. ויש גם אישה אחרת, חברה של אמא שלי מהשכונה, שגילו אצלה מאוחר והיא נפטרה בתוך שנה, וזה היה לפני הרבה שנים ואני הייתי צעירה ולא הבנתי כלום. מה זה עשה לי? עשה לי משהו, אני לא אשקר. שבועיים חשבתי על זה כל בוקר. אמרתי לעצמי סמאח את בת חמישים וחמש ואת לא הלכת מאז. אפילו אמרתי לאבו מוחמד, ואמרתי לו בקול, אמרתי תיקח אותי אחרי החגים. והוא אמר בסדר. ואז החגים עברו, ואז אמא נפלה, וזה נגמר. [שותקת] תשמעי, זה מה שאני לא מצליחה להסביר. אני לא שכחתי. אני זוכרת את זה כל הזמן, זה יושב לי כאן מאחורה. פשוט כל בוקר יש בוקר אחר שדוחף אותו. אני לא אישה ששוכחת. אני אישה שאין לה יום פנוי.</w:t>
       </w:r>
     </w:p>
     <w:p>
@@ -9336,7 +9336,7 @@
           <w:szCs w:val="24"/>
           <w:rtl/>
         </w:rPr>
-        <w:t xml:space="preserve">ת: שיתנו לי תור בשש וחצי בבוקר. זהו. זה מה שהייתי משנה. שהמכון ייפתח בשש ולא בשמונה. אני ערה מארבע, אני לא צריכה שיהיה נעים, אני צריכה שיהיה מוקדם. אם יש לי תור בשש וחצי, אבו מוחמד לוקח אותי, הוא עומד בטנדר למטה, אני נכנסת, זה עשר דקות, אני יוצאת בשבע ורבע ואנחנו בשוק בשבע וארבעים וחמש. הפסדתי ארבעים דקות ולא חצי יום. ארבעים דקות אני יכולה לתת. חצי יום אני לא יכולה לתת. וגם, שיהיה איפה לחנות בלי לשלם, כי בפעם הקודמת שילמנו עשרים ושישה שקל ואבו מוחמד דיבר על זה כל הדרך הביתה. דבר שני, ואת זה אני אומרת מהניסיון של אמא, שמישהי תרים אליי טלפון. לא מכתב. אנשים לא פותחים מכתבים. טלפון, אישה, בערבית, שתגיד לי גברת דיאב, יש לך תור ביום שלישי בשש וחצי, את יכולה? ואם אני אגיד לא, שתגיד לי מתי כן. שתשאל אותי מתי אני כן יכולה. אף אחד מעולם לא שאל אותי מתי אני יכולה. תמיד אומרים לי מתי הם יכולים. [שותקת] ואם ממש רוצים, שיביאו את המכונה לשוק. יש שם מגרש חנייה מאחורה. יעמידו שם ניידת ביום שלישי, נשים יבואו בין לקוח ללקוח. חמישים נשים בשוק בגיל שלי. חמישים.</w:t>
+        <w:t xml:space="preserve">ת: שיתנו לי תור בשש וחצי בבוקר. זהו. זה מה שהייתי משנה. שהמכון ייפתח בשש ולא בשמונה. אני ערה מארבע, אני לא צריכה שיהיה נעים, אני צריכה שיהיה מוקדם. אם יש לי תור בשש וחצי, אבו מוחמד לוקח אותי, הוא עומד בטנדר למטה, אני נכנסת, זה עשר דקות, אני יוצאת בשבע ורבע ואנחנו בשוק בשבע וארבעים וחמש. הפסדתי ארבעים דקות ולא חצי יום. ארבעים דקות אני יכולה לתת. חצי יום אני לא יכולה לתת. וגם, שיהיה איפה לחנות בלי לשלם, כי בפעם הקודמת שילמנו עשרים ושישה שקל ואבו מוחמד דיבר על זה כל הדרך הביתה. דבר שני, ואת זה אני אומרת מהניסיון של אמא, שמישהי תרים אליי טלפון. לא מכתב. אנשים לא פותחים מכתבים. טלפון, אישה, בערבית, שתגיד לי גברת דיאב, יש לך תור ביום שלישי בשש וחצי, את יכולה? ואם אני אגיד לא, שתגיד לי מתי כן. שתשאל אותי מתי אני כן יכולה. אף אחד מעולם לא שאל אותי מתי אני יכולה. תמיד אומרים לי מתי הם יכולים. וכשאני אומרת אני לא יכולה, זה נגמר שם, אף אחד לא חוזר אליי אחרי חודש. ושיכתבו את המכתב בערבית, או בעברית קלה בלי מילים גדולות. יש לי שכנה שקיבלה מכתב וחשבה שזה מהעירייה על ארנונה, בחיי. [שותקת] ואם ממש רוצים, שיביאו את המכונה לשוק. יש שם מגרש חנייה מאחורה. יעמידו שם ניידת ביום שלישי בשש בבוקר, נשים יבואו בין לקוח ללקוח, אני אשלח את אבו מוחמד לעמוד בדוכן שלי עשרים דקות ואני אעמוד בשלו אחר כך. חמישים נשים בשוק בגיל שלי. גם המוכרות וגם הקונות. חמישים. מי שרוצה לתפוס אותנו, שיבוא לשוק לפני שבע. אנחנו שם. אנחנו תמיד שם.</w:t>
       </w:r>
     </w:p>
     <w:p>
@@ -9378,7 +9378,7 @@
           <w:szCs w:val="24"/>
           <w:rtl/>
         </w:rPr>
-        <w:t xml:space="preserve">ת: לא הייתי אומרת לה תלכי, זה כלום, זה חמש דקות. אני שונאת כשאומרים ככה. זה לא כלום. זה בוקר שלם. הייתי מדברת איתה מעשי. הייתי אומרת לה תבחרי את היום הכי חלש שלך בשבוע, לא ראשון ולא חמישי. תשאלי אם יש שעה מוקדמת, תתעקשי על מוקדם. תבררי כמה עולה, ואל תתביישי לשאול, כי אני לא ידעתי שזה חינם עד גיל חמישים ואחת ואף אחד לא אמר לי. תיקחי מישהי איתך, לא בשביל הפחד, בשביל שלא תסתובבי לבד לחפש את הבניין. ואם יש לך אמא בבית או ילד שצריך, תסדרי מי איתם לפני שאת קובעת, כי אחרת את תקבעי ותבטלי. אני יודעת מה אני אומרת. מה שיישאר? [שותקת] שיבינו שזה לא בושה. כל הזמן אומרים על הנשים הערביות שהן מתביישות ושהן מפחדות ושהבעל לא נותן. אצלי הבעל נותן, ואני לא מתביישת, ואני לא מפחדת. אני פשוט אחרונה בתור בבית שלי כבר שלושים שנה, וזה לא נראה לי נורא, ככה חייתי וככה גידלתי ארבעה. אבל אם רוצים שאישה כמוני תלך, שיבואו לשעה שלי. אני לא אבוא לשעה שלהם. זה מה שיש. עכשיו אני צריכה לקום בארבע, אז בואי נסגור את זה.</w:t>
+        <w:t xml:space="preserve">ת: לא הייתי אומרת לה תלכי, זה כלום, זה חמש דקות. אני שונאת כשאומרים ככה. זה לא כלום. זה בוקר שלם. הייתי מדברת איתה מעשי. הייתי אומרת לה תבחרי את היום הכי חלש שלך בשבוע, לא ראשון ולא חמישי. תשאלי אם יש שעה מוקדמת, תתעקשי על מוקדם. תבררי כמה עולה, ואל תתביישי לשאול, כי אני לא ידעתי שזה חינם עד גיל חמישים ואחת ואף אחד לא אמר לי. תיקחי מישהי איתך, לא בשביל הפחד, בשביל שלא תסתובבי לבד לחפש את הבניין. ואם יש לך אמא בבית או ילד שצריך, תסדרי מי איתם לפני שאת קובעת, כי אחרת את תקבעי ותבטלי. אני יודעת מה אני אומרת. מה שיישאר? [שותקת] שיבינו שזה לא בושה. כל הזמן אומרים על הנשים הערביות שהן מתביישות ושהן מפחדות ושהבעל לא נותן. אצלי הבעל נותן, ואני לא מתביישת, ואני לא מפחדת. אני פשוט אחרונה בתור בבית שלי כבר שלושים שנה, וזה לא נראה לי נורא, ככה חייתי וככה גידלתי ארבעה. אבל אם רוצים שאישה כמוני תלך, שיבואו לשעה שלי. אני לא אבוא לשעה שלהם. אני לא יכולה, לא שאני לא רוצה. וגם, אם יש מישהו ששומע את זה אחר כך, שיזכור שאישה כמוני לא תרים טלפון ולא תבקש. אני לא אבקש בחיים. צריך שיתקשרו אליי. זה מה שיש. עכשיו אני צריכה לקום בארבע, אז בואי נסגור את זה.</w:t>
       </w:r>
     </w:p>
     <w:p>

</xml_diff>